<commit_message>
se agrega documentación a la parte de diagramas
</commit_message>
<xml_diff>
--- a/DOCUMENTACION/documentacion_proyecto1_BD_LuisDiego.docx
+++ b/DOCUMENTACION/documentacion_proyecto1_BD_LuisDiego.docx
@@ -39,7 +39,7 @@
                     <pic:cNvPicPr preferRelativeResize="0"/>
                   </pic:nvPicPr>
                   <pic:blipFill>
-                    <a:blip r:embed="rId4">
+                    <a:blip r:embed="rId6">
                       <a:extLst>
                         <a:ext uri="{28A0092B-C50C-407E-A947-70E740481C1C}">
                           <a14:useLocalDpi xmlns:a14="http://schemas.microsoft.com/office/drawing/2010/main" val="0"/>
@@ -239,6 +239,517 @@
       </w:r>
     </w:p>
     <w:p/>
+    <w:p/>
+    <w:p/>
+    <w:p/>
+    <w:p/>
+    <w:p/>
+    <w:sdt>
+      <w:sdtPr>
+        <w:id w:val="-289667600"/>
+        <w:docPartObj>
+          <w:docPartGallery w:val="Table of Contents"/>
+          <w:docPartUnique/>
+        </w:docPartObj>
+      </w:sdtPr>
+      <w:sdtEndPr>
+        <w:rPr>
+          <w:rFonts w:asciiTheme="minorHAnsi" w:eastAsiaTheme="minorHAnsi" w:hAnsiTheme="minorHAnsi" w:cstheme="minorBidi"/>
+          <w:b/>
+          <w:bCs/>
+          <w:color w:val="auto"/>
+          <w:kern w:val="2"/>
+          <w:sz w:val="24"/>
+          <w:szCs w:val="24"/>
+          <w:lang w:eastAsia="en-US"/>
+          <w14:ligatures w14:val="standardContextual"/>
+        </w:rPr>
+      </w:sdtEndPr>
+      <w:sdtContent>
+        <w:p>
+          <w:pPr>
+            <w:pStyle w:val="TtuloTDC"/>
+          </w:pPr>
+          <w:r>
+            <w:t>Contenido</w:t>
+          </w:r>
+        </w:p>
+        <w:p>
+          <w:pPr>
+            <w:pStyle w:val="TDC1"/>
+            <w:tabs>
+              <w:tab w:val="right" w:leader="dot" w:pos="8828"/>
+            </w:tabs>
+            <w:rPr>
+              <w:rFonts w:eastAsiaTheme="minorEastAsia"/>
+              <w:noProof/>
+              <w:lang w:eastAsia="es-MX"/>
+            </w:rPr>
+          </w:pPr>
+          <w:r>
+            <w:fldChar w:fldCharType="begin"/>
+          </w:r>
+          <w:r>
+            <w:instrText xml:space="preserve"> TOC \o "1-3" \h \z \u </w:instrText>
+          </w:r>
+          <w:r>
+            <w:fldChar w:fldCharType="separate"/>
+          </w:r>
+          <w:hyperlink w:anchor="_Toc239684316" w:history="1">
+            <w:r>
+              <w:rPr>
+                <w:rStyle w:val="Hipervnculo"/>
+                <w:noProof/>
+              </w:rPr>
+              <w:t>MODELOS CONCEPTUALES</w:t>
+            </w:r>
+            <w:r>
+              <w:rPr>
+                <w:noProof/>
+                <w:webHidden/>
+              </w:rPr>
+              <w:tab/>
+            </w:r>
+            <w:r>
+              <w:rPr>
+                <w:noProof/>
+                <w:webHidden/>
+              </w:rPr>
+              <w:fldChar w:fldCharType="begin"/>
+            </w:r>
+            <w:r>
+              <w:rPr>
+                <w:noProof/>
+                <w:webHidden/>
+              </w:rPr>
+              <w:instrText xml:space="preserve"> PAGEREF _Toc239684316 \h </w:instrText>
+            </w:r>
+            <w:r>
+              <w:rPr>
+                <w:noProof/>
+                <w:webHidden/>
+              </w:rPr>
+            </w:r>
+            <w:r>
+              <w:rPr>
+                <w:noProof/>
+                <w:webHidden/>
+              </w:rPr>
+              <w:fldChar w:fldCharType="separate"/>
+            </w:r>
+            <w:r>
+              <w:rPr>
+                <w:noProof/>
+                <w:webHidden/>
+              </w:rPr>
+              <w:t>3</w:t>
+            </w:r>
+            <w:r>
+              <w:rPr>
+                <w:noProof/>
+                <w:webHidden/>
+              </w:rPr>
+              <w:fldChar w:fldCharType="end"/>
+            </w:r>
+          </w:hyperlink>
+        </w:p>
+        <w:p>
+          <w:r>
+            <w:rPr>
+              <w:b/>
+              <w:bCs/>
+            </w:rPr>
+            <w:fldChar w:fldCharType="end"/>
+          </w:r>
+        </w:p>
+      </w:sdtContent>
+    </w:sdt>
+    <w:p/>
+    <w:p/>
+    <w:p/>
+    <w:p/>
+    <w:p/>
+    <w:p/>
+    <w:p/>
+    <w:p/>
+    <w:p/>
+    <w:p/>
+    <w:p/>
+    <w:p/>
+    <w:p/>
+    <w:p/>
+    <w:p/>
+    <w:p/>
+    <w:p/>
+    <w:p/>
+    <w:p/>
+    <w:p/>
+    <w:p/>
+    <w:p>
+      <w:pPr>
+        <w:pStyle w:val="Ttulo1"/>
+      </w:pPr>
+      <w:bookmarkStart w:id="0" w:name="_Toc239684316"/>
+    </w:p>
+    <w:p>
+      <w:pPr>
+        <w:pStyle w:val="Ttulo1"/>
+      </w:pPr>
+      <w:r>
+        <w:t>MODELOS CONCEPTUALES</w:t>
+      </w:r>
+      <w:bookmarkEnd w:id="0"/>
+    </w:p>
+    <w:p/>
+    <w:p>
+      <w:pPr>
+        <w:pStyle w:val="Subttulo"/>
+        <w:numPr>
+          <w:ilvl w:val="0"/>
+          <w:numId w:val="0"/>
+        </w:numPr>
+      </w:pPr>
+    </w:p>
+    <w:p>
+      <w:pPr>
+        <w:pStyle w:val="Subttulo"/>
+        <w:numPr>
+          <w:ilvl w:val="0"/>
+          <w:numId w:val="2"/>
+        </w:numPr>
+      </w:pPr>
+      <w:r>
+        <w:t>Diagrama Modulo 1: Gestión De Ubicaciones</w:t>
+      </w:r>
+    </w:p>
+    <w:p>
+      <w:r>
+        <w:t xml:space="preserve">En este módulo, la idea es agregar las ubicaciones relacionadas a los distintos eventos que hay, por </w:t>
+      </w:r>
+      <w:r>
+        <w:t>ende,</w:t>
+      </w:r>
+      <w:r>
+        <w:t xml:space="preserve"> se han identificado las </w:t>
+      </w:r>
+      <w:r>
+        <w:t>siguientes entidades</w:t>
+      </w:r>
+      <w:r>
+        <w:t xml:space="preserve"> con sus </w:t>
+      </w:r>
+      <w:r>
+        <w:t>atributos:</w:t>
+      </w:r>
+    </w:p>
+    <w:p/>
+    <w:p>
+      <w:pPr>
+        <w:pStyle w:val="Prrafodelista"/>
+        <w:numPr>
+          <w:ilvl w:val="0"/>
+          <w:numId w:val="3"/>
+        </w:numPr>
+      </w:pPr>
+      <w:r>
+        <w:t>UBICACI</w:t>
+      </w:r>
+      <w:r>
+        <w:t>O</w:t>
+      </w:r>
+      <w:r>
+        <w:t xml:space="preserve">N: </w:t>
+      </w:r>
+    </w:p>
+    <w:p>
+      <w:pPr>
+        <w:pStyle w:val="Prrafodelista"/>
+        <w:numPr>
+          <w:ilvl w:val="0"/>
+          <w:numId w:val="4"/>
+        </w:numPr>
+      </w:pPr>
+      <w:r>
+        <w:t>Id_ubicacion (PK)</w:t>
+      </w:r>
+    </w:p>
+    <w:p>
+      <w:pPr>
+        <w:pStyle w:val="Prrafodelista"/>
+        <w:numPr>
+          <w:ilvl w:val="0"/>
+          <w:numId w:val="4"/>
+        </w:numPr>
+      </w:pPr>
+      <w:r>
+        <w:t>Nombre</w:t>
+      </w:r>
+    </w:p>
+    <w:p>
+      <w:pPr>
+        <w:pStyle w:val="Prrafodelista"/>
+        <w:numPr>
+          <w:ilvl w:val="0"/>
+          <w:numId w:val="4"/>
+        </w:numPr>
+      </w:pPr>
+      <w:r>
+        <w:t>Dirección</w:t>
+      </w:r>
+    </w:p>
+    <w:p>
+      <w:pPr>
+        <w:pStyle w:val="Prrafodelista"/>
+        <w:numPr>
+          <w:ilvl w:val="0"/>
+          <w:numId w:val="4"/>
+        </w:numPr>
+      </w:pPr>
+      <w:r>
+        <w:t>Ciudad</w:t>
+      </w:r>
+    </w:p>
+    <w:p>
+      <w:pPr>
+        <w:pStyle w:val="Prrafodelista"/>
+        <w:numPr>
+          <w:ilvl w:val="0"/>
+          <w:numId w:val="4"/>
+        </w:numPr>
+      </w:pPr>
+      <w:r>
+        <w:t>Capacidad</w:t>
+      </w:r>
+    </w:p>
+    <w:p>
+      <w:r>
+        <w:t>Además,</w:t>
+      </w:r>
+      <w:r>
+        <w:t xml:space="preserve"> que en el modelo lógico tendremos </w:t>
+      </w:r>
+      <w:r>
+        <w:t xml:space="preserve">en la entidad/tabla </w:t>
+      </w:r>
+      <w:r>
+        <w:t>EVENTOS,</w:t>
+      </w:r>
+      <w:r>
+        <w:t xml:space="preserve"> una </w:t>
+      </w:r>
+      <w:r>
+        <w:t>FK =id_ubicacion, que refere</w:t>
+      </w:r>
+      <w:r>
+        <w:t>ncia justamente a la llave primaria de la entidad/</w:t>
+      </w:r>
+      <w:r>
+        <w:t xml:space="preserve">tabla </w:t>
+      </w:r>
+      <w:r>
+        <w:t>UBICACIÓN</w:t>
+      </w:r>
+    </w:p>
+    <w:p/>
+    <w:p>
+      <w:r>
+        <w:t>Por aparte también podemos hablar sobre la relación que existe en este diagrama</w:t>
+      </w:r>
+    </w:p>
+    <w:p>
+      <w:pPr>
+        <w:pStyle w:val="Prrafodelista"/>
+        <w:numPr>
+          <w:ilvl w:val="0"/>
+          <w:numId w:val="4"/>
+        </w:numPr>
+      </w:pPr>
+      <w:r>
+        <w:t>TIENEN</w:t>
+      </w:r>
+    </w:p>
+    <w:p>
+      <w:r>
+        <w:t>Esto haría que UBICACIÓN-EVENTOS tenga cardinalidad 1:N, pues una ubicación se puede relacionar con varios eventos, mientras que un evento solo se refiere a una única ubicación.</w:t>
+      </w:r>
+    </w:p>
+    <w:p/>
+    <w:p>
+      <w:r>
+        <w:t>Por lo tanto, tendríamos el siguiente diagrama:</w:t>
+      </w:r>
+    </w:p>
+    <w:p>
+      <w:r>
+        <w:lastRenderedPageBreak/>
+        <w:drawing>
+          <wp:inline distT="0" distB="0" distL="0" distR="0" wp14:anchorId="437EC6D8" wp14:editId="719F245B">
+            <wp:extent cx="4465707" cy="4663844"/>
+            <wp:effectExtent l="0" t="0" r="0" b="3810"/>
+            <wp:docPr id="483178456" name="Imagen 1"/>
+            <wp:cNvGraphicFramePr>
+              <a:graphicFrameLocks xmlns:a="http://schemas.openxmlformats.org/drawingml/2006/main" noChangeAspect="1"/>
+            </wp:cNvGraphicFramePr>
+            <a:graphic xmlns:a="http://schemas.openxmlformats.org/drawingml/2006/main">
+              <a:graphicData uri="http://schemas.openxmlformats.org/drawingml/2006/picture">
+                <pic:pic xmlns:pic="http://schemas.openxmlformats.org/drawingml/2006/picture">
+                  <pic:nvPicPr>
+                    <pic:cNvPr id="483178456" name=""/>
+                    <pic:cNvPicPr/>
+                  </pic:nvPicPr>
+                  <pic:blipFill>
+                    <a:blip r:embed="rId7"/>
+                    <a:stretch>
+                      <a:fillRect/>
+                    </a:stretch>
+                  </pic:blipFill>
+                  <pic:spPr>
+                    <a:xfrm>
+                      <a:off x="0" y="0"/>
+                      <a:ext cx="4465707" cy="4663844"/>
+                    </a:xfrm>
+                    <a:prstGeom prst="rect">
+                      <a:avLst/>
+                    </a:prstGeom>
+                  </pic:spPr>
+                </pic:pic>
+              </a:graphicData>
+            </a:graphic>
+          </wp:inline>
+        </w:drawing>
+      </w:r>
+    </w:p>
+    <w:p/>
+    <w:p>
+      <w:pPr>
+        <w:pStyle w:val="Subttulo"/>
+        <w:numPr>
+          <w:ilvl w:val="0"/>
+          <w:numId w:val="2"/>
+        </w:numPr>
+      </w:pPr>
+      <w:r>
+        <w:t>DIAGRAMA MÓDULO 2: EVENTOS RECURRENTES</w:t>
+      </w:r>
+    </w:p>
+    <w:p/>
+    <w:p>
+      <w:r>
+        <w:t>En este caso, la información almacenada en la Base de Datos da un significado de los distintos eventos y las series que pueden llegar a tener. Además, brinda detalles de cuando se da o se dio x evento.</w:t>
+      </w:r>
+    </w:p>
+    <w:p/>
+    <w:p>
+      <w:r>
+        <w:t>Las entidades identificadas con sus atributos son:</w:t>
+      </w:r>
+    </w:p>
+    <w:p>
+      <w:pPr>
+        <w:pStyle w:val="Prrafodelista"/>
+        <w:numPr>
+          <w:ilvl w:val="0"/>
+          <w:numId w:val="5"/>
+        </w:numPr>
+      </w:pPr>
+      <w:r>
+        <w:t>SERIES_EVENTOS</w:t>
+      </w:r>
+    </w:p>
+    <w:p>
+      <w:pPr>
+        <w:pStyle w:val="Prrafodelista"/>
+        <w:numPr>
+          <w:ilvl w:val="0"/>
+          <w:numId w:val="4"/>
+        </w:numPr>
+      </w:pPr>
+      <w:r>
+        <w:t>id_serie: PK</w:t>
+      </w:r>
+    </w:p>
+    <w:p>
+      <w:pPr>
+        <w:pStyle w:val="Prrafodelista"/>
+        <w:numPr>
+          <w:ilvl w:val="0"/>
+          <w:numId w:val="4"/>
+        </w:numPr>
+      </w:pPr>
+      <w:r>
+        <w:t>fecha_inicio</w:t>
+      </w:r>
+    </w:p>
+    <w:p>
+      <w:pPr>
+        <w:pStyle w:val="Prrafodelista"/>
+        <w:numPr>
+          <w:ilvl w:val="0"/>
+          <w:numId w:val="4"/>
+        </w:numPr>
+      </w:pPr>
+      <w:r>
+        <w:t>fecha_fin</w:t>
+      </w:r>
+    </w:p>
+    <w:p>
+      <w:pPr>
+        <w:pStyle w:val="Prrafodelista"/>
+        <w:numPr>
+          <w:ilvl w:val="0"/>
+          <w:numId w:val="4"/>
+        </w:numPr>
+      </w:pPr>
+      <w:r>
+        <w:lastRenderedPageBreak/>
+        <w:t>reglas_patrones_periodicidad-&gt;se divide en 3 sub-atributos. Tenemos “clase_periodicidad”, el cual nos indica si el evento se repite diaria, semanal o mensualmente</w:t>
+      </w:r>
+      <w:r>
+        <w:t xml:space="preserve"> o personalizado</w:t>
+      </w:r>
+      <w:r>
+        <w:t xml:space="preserve"> (</w:t>
+      </w:r>
+      <w:r>
+        <w:t xml:space="preserve">El usuario debe ingresar una de esas </w:t>
+      </w:r>
+      <w:r>
+        <w:t>4</w:t>
+      </w:r>
+      <w:r>
+        <w:t xml:space="preserve"> opciones</w:t>
+      </w:r>
+      <w:r>
+        <w:t xml:space="preserve">). Luego contamos con “intervalo_en_dias_evento” el cual refleja cada cuanto </w:t>
+      </w:r>
+      <w:r>
+        <w:t>se repite el evento, en caso de elegir que se repita de manera personalizada el evento.</w:t>
+      </w:r>
+    </w:p>
+    <w:p>
+      <w:pPr>
+        <w:pStyle w:val="Prrafodelista"/>
+      </w:pPr>
+    </w:p>
+    <w:p>
+      <w:pPr>
+        <w:pStyle w:val="Prrafodelista"/>
+      </w:pPr>
+      <w:r>
+        <w:t xml:space="preserve"> Esto quiere decir que el atributo </w:t>
+      </w:r>
+      <w:r>
+        <w:t>“intervalo_en_dias_evento”</w:t>
+      </w:r>
+      <w:r>
+        <w:t xml:space="preserve"> es NULO en caso de que se elija una clase de periodicidad distinta a ‘personalizado’, en caso contrario, se llenan ambos campos de los atributos, el primer atributo tendría un registro= ‘personalizado’ y el otro atributo tendría el intervalo en X días de repetición.</w:t>
+      </w:r>
+    </w:p>
+    <w:p/>
+    <w:p/>
+    <w:p/>
+    <w:p/>
+    <w:p/>
     <w:sectPr>
       <w:pgSz w:w="12240" w:h="15840"/>
       <w:pgMar w:top="1417" w:right="1701" w:bottom="1417" w:left="1701" w:header="708" w:footer="708" w:gutter="0"/>
@@ -247,6 +758,541 @@
     </w:sectPr>
   </w:body>
 </w:document>
+</file>
+
+<file path=word/numbering.xml><?xml version="1.0" encoding="utf-8"?>
+<w:numbering xmlns:wpc="http://schemas.microsoft.com/office/word/2010/wordprocessingCanvas" xmlns:cx="http://schemas.microsoft.com/office/drawing/2014/chartex" xmlns:cx1="http://schemas.microsoft.com/office/drawing/2015/9/8/chartex" xmlns:cx2="http://schemas.microsoft.com/office/drawing/2015/10/21/chartex" xmlns:cx3="http://schemas.microsoft.com/office/drawing/2016/5/9/chartex" xmlns:cx4="http://schemas.microsoft.com/office/drawing/2016/5/10/chartex" xmlns:cx5="http://schemas.microsoft.com/office/drawing/2016/5/11/chartex" xmlns:cx6="http://schemas.microsoft.com/office/drawing/2016/5/12/chartex" xmlns:cx7="http://schemas.microsoft.com/office/drawing/2016/5/13/chartex" xmlns:cx8="http://schemas.microsoft.com/office/drawing/2016/5/14/chartex" xmlns:mc="http://schemas.openxmlformats.org/markup-compatibility/2006" xmlns:aink="http://schemas.microsoft.com/office/drawing/2016/ink" xmlns:am3d="http://schemas.microsoft.com/office/drawing/2017/model3d" xmlns:o="urn:schemas-microsoft-com:office:office" xmlns:oel="http://schemas.microsoft.com/office/2019/extlst" xmlns:r="http://schemas.openxmlformats.org/officeDocument/2006/relationships" xmlns:m="http://schemas.openxmlformats.org/officeDocument/2006/math" xmlns:v="urn:schemas-microsoft-com:vml" xmlns:wp14="http://schemas.microsoft.com/office/word/2010/wordprocessingDrawing" xmlns:wp="http://schemas.openxmlformats.org/drawingml/2006/wordprocessingDrawing" xmlns:w10="urn:schemas-microsoft-com:office:word" xmlns:w="http://schemas.openxmlformats.org/wordprocessingml/2006/main" xmlns:w14="http://schemas.microsoft.com/office/word/2010/wordml" xmlns:w15="http://schemas.microsoft.com/office/word/2012/wordml" xmlns:w16cex="http://schemas.microsoft.com/office/word/2018/wordml/cex" xmlns:w16cid="http://schemas.microsoft.com/office/word/2016/wordml/cid" xmlns:w16="http://schemas.microsoft.com/office/word/2018/wordml" xmlns:w16du="http://schemas.microsoft.com/office/word/2023/wordml/word16du" xmlns:w16sdtdh="http://schemas.microsoft.com/office/word/2020/wordml/sdtdatahash" xmlns:w16sdtfl="http://schemas.microsoft.com/office/word/2024/wordml/sdtformatlock" xmlns:w16se="http://schemas.microsoft.com/office/word/2015/wordml/symex" xmlns:wpg="http://schemas.microsoft.com/office/word/2010/wordprocessingGroup" xmlns:wpi="http://schemas.microsoft.com/office/word/2010/wordprocessingInk" xmlns:wne="http://schemas.microsoft.com/office/word/2006/wordml" xmlns:wps="http://schemas.microsoft.com/office/word/2010/wordprocessingShape" mc:Ignorable="w14 w15 w16se w16cid w16 w16cex w16sdtdh w16sdtfl w16du wp14">
+  <w:abstractNum w:abstractNumId="0" w15:restartNumberingAfterBreak="0">
+    <w:nsid w:val="2BE22675"/>
+    <w:multiLevelType w:val="hybridMultilevel"/>
+    <w:tmpl w:val="6A1C3A06"/>
+    <w:lvl w:ilvl="0" w:tplc="080A0011">
+      <w:start w:val="1"/>
+      <w:numFmt w:val="decimal"/>
+      <w:lvlText w:val="%1)"/>
+      <w:lvlJc w:val="left"/>
+      <w:pPr>
+        <w:ind w:left="720" w:hanging="360"/>
+      </w:pPr>
+      <w:rPr>
+        <w:rFonts w:hint="default"/>
+      </w:rPr>
+    </w:lvl>
+    <w:lvl w:ilvl="1" w:tplc="080A0019" w:tentative="1">
+      <w:start w:val="1"/>
+      <w:numFmt w:val="lowerLetter"/>
+      <w:lvlText w:val="%2."/>
+      <w:lvlJc w:val="left"/>
+      <w:pPr>
+        <w:ind w:left="1440" w:hanging="360"/>
+      </w:pPr>
+    </w:lvl>
+    <w:lvl w:ilvl="2" w:tplc="080A001B" w:tentative="1">
+      <w:start w:val="1"/>
+      <w:numFmt w:val="lowerRoman"/>
+      <w:lvlText w:val="%3."/>
+      <w:lvlJc w:val="right"/>
+      <w:pPr>
+        <w:ind w:left="2160" w:hanging="180"/>
+      </w:pPr>
+    </w:lvl>
+    <w:lvl w:ilvl="3" w:tplc="080A000F" w:tentative="1">
+      <w:start w:val="1"/>
+      <w:numFmt w:val="decimal"/>
+      <w:lvlText w:val="%4."/>
+      <w:lvlJc w:val="left"/>
+      <w:pPr>
+        <w:ind w:left="2880" w:hanging="360"/>
+      </w:pPr>
+    </w:lvl>
+    <w:lvl w:ilvl="4" w:tplc="080A0019" w:tentative="1">
+      <w:start w:val="1"/>
+      <w:numFmt w:val="lowerLetter"/>
+      <w:lvlText w:val="%5."/>
+      <w:lvlJc w:val="left"/>
+      <w:pPr>
+        <w:ind w:left="3600" w:hanging="360"/>
+      </w:pPr>
+    </w:lvl>
+    <w:lvl w:ilvl="5" w:tplc="080A001B" w:tentative="1">
+      <w:start w:val="1"/>
+      <w:numFmt w:val="lowerRoman"/>
+      <w:lvlText w:val="%6."/>
+      <w:lvlJc w:val="right"/>
+      <w:pPr>
+        <w:ind w:left="4320" w:hanging="180"/>
+      </w:pPr>
+    </w:lvl>
+    <w:lvl w:ilvl="6" w:tplc="080A000F" w:tentative="1">
+      <w:start w:val="1"/>
+      <w:numFmt w:val="decimal"/>
+      <w:lvlText w:val="%7."/>
+      <w:lvlJc w:val="left"/>
+      <w:pPr>
+        <w:ind w:left="5040" w:hanging="360"/>
+      </w:pPr>
+    </w:lvl>
+    <w:lvl w:ilvl="7" w:tplc="080A0019" w:tentative="1">
+      <w:start w:val="1"/>
+      <w:numFmt w:val="lowerLetter"/>
+      <w:lvlText w:val="%8."/>
+      <w:lvlJc w:val="left"/>
+      <w:pPr>
+        <w:ind w:left="5760" w:hanging="360"/>
+      </w:pPr>
+    </w:lvl>
+    <w:lvl w:ilvl="8" w:tplc="080A001B" w:tentative="1">
+      <w:start w:val="1"/>
+      <w:numFmt w:val="lowerRoman"/>
+      <w:lvlText w:val="%9."/>
+      <w:lvlJc w:val="right"/>
+      <w:pPr>
+        <w:ind w:left="6480" w:hanging="180"/>
+      </w:pPr>
+    </w:lvl>
+  </w:abstractNum>
+  <w:abstractNum w:abstractNumId="1" w15:restartNumberingAfterBreak="0">
+    <w:nsid w:val="49493616"/>
+    <w:multiLevelType w:val="hybridMultilevel"/>
+    <w:tmpl w:val="748A5512"/>
+    <w:lvl w:ilvl="0" w:tplc="D36EE1C2">
+      <w:numFmt w:val="bullet"/>
+      <w:lvlText w:val=""/>
+      <w:lvlJc w:val="left"/>
+      <w:pPr>
+        <w:ind w:left="720" w:hanging="360"/>
+      </w:pPr>
+      <w:rPr>
+        <w:rFonts w:ascii="Symbol" w:eastAsiaTheme="majorEastAsia" w:hAnsi="Symbol" w:cstheme="majorBidi" w:hint="default"/>
+      </w:rPr>
+    </w:lvl>
+    <w:lvl w:ilvl="1" w:tplc="080A0003" w:tentative="1">
+      <w:start w:val="1"/>
+      <w:numFmt w:val="bullet"/>
+      <w:lvlText w:val="o"/>
+      <w:lvlJc w:val="left"/>
+      <w:pPr>
+        <w:ind w:left="1440" w:hanging="360"/>
+      </w:pPr>
+      <w:rPr>
+        <w:rFonts w:ascii="Courier New" w:hAnsi="Courier New" w:cs="Courier New" w:hint="default"/>
+      </w:rPr>
+    </w:lvl>
+    <w:lvl w:ilvl="2" w:tplc="080A0005" w:tentative="1">
+      <w:start w:val="1"/>
+      <w:numFmt w:val="bullet"/>
+      <w:lvlText w:val=""/>
+      <w:lvlJc w:val="left"/>
+      <w:pPr>
+        <w:ind w:left="2160" w:hanging="360"/>
+      </w:pPr>
+      <w:rPr>
+        <w:rFonts w:ascii="Wingdings" w:hAnsi="Wingdings" w:hint="default"/>
+      </w:rPr>
+    </w:lvl>
+    <w:lvl w:ilvl="3" w:tplc="080A0001" w:tentative="1">
+      <w:start w:val="1"/>
+      <w:numFmt w:val="bullet"/>
+      <w:lvlText w:val=""/>
+      <w:lvlJc w:val="left"/>
+      <w:pPr>
+        <w:ind w:left="2880" w:hanging="360"/>
+      </w:pPr>
+      <w:rPr>
+        <w:rFonts w:ascii="Symbol" w:hAnsi="Symbol" w:hint="default"/>
+      </w:rPr>
+    </w:lvl>
+    <w:lvl w:ilvl="4" w:tplc="080A0003" w:tentative="1">
+      <w:start w:val="1"/>
+      <w:numFmt w:val="bullet"/>
+      <w:lvlText w:val="o"/>
+      <w:lvlJc w:val="left"/>
+      <w:pPr>
+        <w:ind w:left="3600" w:hanging="360"/>
+      </w:pPr>
+      <w:rPr>
+        <w:rFonts w:ascii="Courier New" w:hAnsi="Courier New" w:cs="Courier New" w:hint="default"/>
+      </w:rPr>
+    </w:lvl>
+    <w:lvl w:ilvl="5" w:tplc="080A0005" w:tentative="1">
+      <w:start w:val="1"/>
+      <w:numFmt w:val="bullet"/>
+      <w:lvlText w:val=""/>
+      <w:lvlJc w:val="left"/>
+      <w:pPr>
+        <w:ind w:left="4320" w:hanging="360"/>
+      </w:pPr>
+      <w:rPr>
+        <w:rFonts w:ascii="Wingdings" w:hAnsi="Wingdings" w:hint="default"/>
+      </w:rPr>
+    </w:lvl>
+    <w:lvl w:ilvl="6" w:tplc="080A0001" w:tentative="1">
+      <w:start w:val="1"/>
+      <w:numFmt w:val="bullet"/>
+      <w:lvlText w:val=""/>
+      <w:lvlJc w:val="left"/>
+      <w:pPr>
+        <w:ind w:left="5040" w:hanging="360"/>
+      </w:pPr>
+      <w:rPr>
+        <w:rFonts w:ascii="Symbol" w:hAnsi="Symbol" w:hint="default"/>
+      </w:rPr>
+    </w:lvl>
+    <w:lvl w:ilvl="7" w:tplc="080A0003" w:tentative="1">
+      <w:start w:val="1"/>
+      <w:numFmt w:val="bullet"/>
+      <w:lvlText w:val="o"/>
+      <w:lvlJc w:val="left"/>
+      <w:pPr>
+        <w:ind w:left="5760" w:hanging="360"/>
+      </w:pPr>
+      <w:rPr>
+        <w:rFonts w:ascii="Courier New" w:hAnsi="Courier New" w:cs="Courier New" w:hint="default"/>
+      </w:rPr>
+    </w:lvl>
+    <w:lvl w:ilvl="8" w:tplc="080A0005" w:tentative="1">
+      <w:start w:val="1"/>
+      <w:numFmt w:val="bullet"/>
+      <w:lvlText w:val=""/>
+      <w:lvlJc w:val="left"/>
+      <w:pPr>
+        <w:ind w:left="6480" w:hanging="360"/>
+      </w:pPr>
+      <w:rPr>
+        <w:rFonts w:ascii="Wingdings" w:hAnsi="Wingdings" w:hint="default"/>
+      </w:rPr>
+    </w:lvl>
+  </w:abstractNum>
+  <w:abstractNum w:abstractNumId="2" w15:restartNumberingAfterBreak="0">
+    <w:nsid w:val="4DCC4FE9"/>
+    <w:multiLevelType w:val="hybridMultilevel"/>
+    <w:tmpl w:val="48FC83DA"/>
+    <w:lvl w:ilvl="0" w:tplc="34FE3E44">
+      <w:start w:val="1"/>
+      <w:numFmt w:val="bullet"/>
+      <w:lvlText w:val="-"/>
+      <w:lvlJc w:val="left"/>
+      <w:pPr>
+        <w:ind w:left="720" w:hanging="360"/>
+      </w:pPr>
+      <w:rPr>
+        <w:rFonts w:ascii="Aptos" w:eastAsiaTheme="minorHAnsi" w:hAnsi="Aptos" w:cstheme="minorBidi" w:hint="default"/>
+      </w:rPr>
+    </w:lvl>
+    <w:lvl w:ilvl="1" w:tplc="080A0003" w:tentative="1">
+      <w:start w:val="1"/>
+      <w:numFmt w:val="bullet"/>
+      <w:lvlText w:val="o"/>
+      <w:lvlJc w:val="left"/>
+      <w:pPr>
+        <w:ind w:left="1440" w:hanging="360"/>
+      </w:pPr>
+      <w:rPr>
+        <w:rFonts w:ascii="Courier New" w:hAnsi="Courier New" w:cs="Courier New" w:hint="default"/>
+      </w:rPr>
+    </w:lvl>
+    <w:lvl w:ilvl="2" w:tplc="080A0005" w:tentative="1">
+      <w:start w:val="1"/>
+      <w:numFmt w:val="bullet"/>
+      <w:lvlText w:val=""/>
+      <w:lvlJc w:val="left"/>
+      <w:pPr>
+        <w:ind w:left="2160" w:hanging="360"/>
+      </w:pPr>
+      <w:rPr>
+        <w:rFonts w:ascii="Wingdings" w:hAnsi="Wingdings" w:hint="default"/>
+      </w:rPr>
+    </w:lvl>
+    <w:lvl w:ilvl="3" w:tplc="080A0001" w:tentative="1">
+      <w:start w:val="1"/>
+      <w:numFmt w:val="bullet"/>
+      <w:lvlText w:val=""/>
+      <w:lvlJc w:val="left"/>
+      <w:pPr>
+        <w:ind w:left="2880" w:hanging="360"/>
+      </w:pPr>
+      <w:rPr>
+        <w:rFonts w:ascii="Symbol" w:hAnsi="Symbol" w:hint="default"/>
+      </w:rPr>
+    </w:lvl>
+    <w:lvl w:ilvl="4" w:tplc="080A0003" w:tentative="1">
+      <w:start w:val="1"/>
+      <w:numFmt w:val="bullet"/>
+      <w:lvlText w:val="o"/>
+      <w:lvlJc w:val="left"/>
+      <w:pPr>
+        <w:ind w:left="3600" w:hanging="360"/>
+      </w:pPr>
+      <w:rPr>
+        <w:rFonts w:ascii="Courier New" w:hAnsi="Courier New" w:cs="Courier New" w:hint="default"/>
+      </w:rPr>
+    </w:lvl>
+    <w:lvl w:ilvl="5" w:tplc="080A0005" w:tentative="1">
+      <w:start w:val="1"/>
+      <w:numFmt w:val="bullet"/>
+      <w:lvlText w:val=""/>
+      <w:lvlJc w:val="left"/>
+      <w:pPr>
+        <w:ind w:left="4320" w:hanging="360"/>
+      </w:pPr>
+      <w:rPr>
+        <w:rFonts w:ascii="Wingdings" w:hAnsi="Wingdings" w:hint="default"/>
+      </w:rPr>
+    </w:lvl>
+    <w:lvl w:ilvl="6" w:tplc="080A0001" w:tentative="1">
+      <w:start w:val="1"/>
+      <w:numFmt w:val="bullet"/>
+      <w:lvlText w:val=""/>
+      <w:lvlJc w:val="left"/>
+      <w:pPr>
+        <w:ind w:left="5040" w:hanging="360"/>
+      </w:pPr>
+      <w:rPr>
+        <w:rFonts w:ascii="Symbol" w:hAnsi="Symbol" w:hint="default"/>
+      </w:rPr>
+    </w:lvl>
+    <w:lvl w:ilvl="7" w:tplc="080A0003" w:tentative="1">
+      <w:start w:val="1"/>
+      <w:numFmt w:val="bullet"/>
+      <w:lvlText w:val="o"/>
+      <w:lvlJc w:val="left"/>
+      <w:pPr>
+        <w:ind w:left="5760" w:hanging="360"/>
+      </w:pPr>
+      <w:rPr>
+        <w:rFonts w:ascii="Courier New" w:hAnsi="Courier New" w:cs="Courier New" w:hint="default"/>
+      </w:rPr>
+    </w:lvl>
+    <w:lvl w:ilvl="8" w:tplc="080A0005" w:tentative="1">
+      <w:start w:val="1"/>
+      <w:numFmt w:val="bullet"/>
+      <w:lvlText w:val=""/>
+      <w:lvlJc w:val="left"/>
+      <w:pPr>
+        <w:ind w:left="6480" w:hanging="360"/>
+      </w:pPr>
+      <w:rPr>
+        <w:rFonts w:ascii="Wingdings" w:hAnsi="Wingdings" w:hint="default"/>
+      </w:rPr>
+    </w:lvl>
+  </w:abstractNum>
+  <w:abstractNum w:abstractNumId="3" w15:restartNumberingAfterBreak="0">
+    <w:nsid w:val="56E00D8E"/>
+    <w:multiLevelType w:val="hybridMultilevel"/>
+    <w:tmpl w:val="B39626FE"/>
+    <w:lvl w:ilvl="0" w:tplc="080A0011">
+      <w:start w:val="1"/>
+      <w:numFmt w:val="decimal"/>
+      <w:lvlText w:val="%1)"/>
+      <w:lvlJc w:val="left"/>
+      <w:pPr>
+        <w:ind w:left="720" w:hanging="360"/>
+      </w:pPr>
+      <w:rPr>
+        <w:rFonts w:hint="default"/>
+      </w:rPr>
+    </w:lvl>
+    <w:lvl w:ilvl="1" w:tplc="080A0019" w:tentative="1">
+      <w:start w:val="1"/>
+      <w:numFmt w:val="lowerLetter"/>
+      <w:lvlText w:val="%2."/>
+      <w:lvlJc w:val="left"/>
+      <w:pPr>
+        <w:ind w:left="1440" w:hanging="360"/>
+      </w:pPr>
+    </w:lvl>
+    <w:lvl w:ilvl="2" w:tplc="080A001B" w:tentative="1">
+      <w:start w:val="1"/>
+      <w:numFmt w:val="lowerRoman"/>
+      <w:lvlText w:val="%3."/>
+      <w:lvlJc w:val="right"/>
+      <w:pPr>
+        <w:ind w:left="2160" w:hanging="180"/>
+      </w:pPr>
+    </w:lvl>
+    <w:lvl w:ilvl="3" w:tplc="080A000F" w:tentative="1">
+      <w:start w:val="1"/>
+      <w:numFmt w:val="decimal"/>
+      <w:lvlText w:val="%4."/>
+      <w:lvlJc w:val="left"/>
+      <w:pPr>
+        <w:ind w:left="2880" w:hanging="360"/>
+      </w:pPr>
+    </w:lvl>
+    <w:lvl w:ilvl="4" w:tplc="080A0019" w:tentative="1">
+      <w:start w:val="1"/>
+      <w:numFmt w:val="lowerLetter"/>
+      <w:lvlText w:val="%5."/>
+      <w:lvlJc w:val="left"/>
+      <w:pPr>
+        <w:ind w:left="3600" w:hanging="360"/>
+      </w:pPr>
+    </w:lvl>
+    <w:lvl w:ilvl="5" w:tplc="080A001B" w:tentative="1">
+      <w:start w:val="1"/>
+      <w:numFmt w:val="lowerRoman"/>
+      <w:lvlText w:val="%6."/>
+      <w:lvlJc w:val="right"/>
+      <w:pPr>
+        <w:ind w:left="4320" w:hanging="180"/>
+      </w:pPr>
+    </w:lvl>
+    <w:lvl w:ilvl="6" w:tplc="080A000F" w:tentative="1">
+      <w:start w:val="1"/>
+      <w:numFmt w:val="decimal"/>
+      <w:lvlText w:val="%7."/>
+      <w:lvlJc w:val="left"/>
+      <w:pPr>
+        <w:ind w:left="5040" w:hanging="360"/>
+      </w:pPr>
+    </w:lvl>
+    <w:lvl w:ilvl="7" w:tplc="080A0019" w:tentative="1">
+      <w:start w:val="1"/>
+      <w:numFmt w:val="lowerLetter"/>
+      <w:lvlText w:val="%8."/>
+      <w:lvlJc w:val="left"/>
+      <w:pPr>
+        <w:ind w:left="5760" w:hanging="360"/>
+      </w:pPr>
+    </w:lvl>
+    <w:lvl w:ilvl="8" w:tplc="080A001B" w:tentative="1">
+      <w:start w:val="1"/>
+      <w:numFmt w:val="lowerRoman"/>
+      <w:lvlText w:val="%9."/>
+      <w:lvlJc w:val="right"/>
+      <w:pPr>
+        <w:ind w:left="6480" w:hanging="180"/>
+      </w:pPr>
+    </w:lvl>
+  </w:abstractNum>
+  <w:abstractNum w:abstractNumId="4" w15:restartNumberingAfterBreak="0">
+    <w:nsid w:val="70676394"/>
+    <w:multiLevelType w:val="hybridMultilevel"/>
+    <w:tmpl w:val="2062C996"/>
+    <w:lvl w:ilvl="0" w:tplc="A3602266">
+      <w:numFmt w:val="bullet"/>
+      <w:lvlText w:val=""/>
+      <w:lvlJc w:val="left"/>
+      <w:pPr>
+        <w:ind w:left="720" w:hanging="360"/>
+      </w:pPr>
+      <w:rPr>
+        <w:rFonts w:ascii="Symbol" w:eastAsiaTheme="majorEastAsia" w:hAnsi="Symbol" w:cstheme="majorBidi" w:hint="default"/>
+      </w:rPr>
+    </w:lvl>
+    <w:lvl w:ilvl="1" w:tplc="080A0003" w:tentative="1">
+      <w:start w:val="1"/>
+      <w:numFmt w:val="bullet"/>
+      <w:lvlText w:val="o"/>
+      <w:lvlJc w:val="left"/>
+      <w:pPr>
+        <w:ind w:left="1440" w:hanging="360"/>
+      </w:pPr>
+      <w:rPr>
+        <w:rFonts w:ascii="Courier New" w:hAnsi="Courier New" w:cs="Courier New" w:hint="default"/>
+      </w:rPr>
+    </w:lvl>
+    <w:lvl w:ilvl="2" w:tplc="080A0005" w:tentative="1">
+      <w:start w:val="1"/>
+      <w:numFmt w:val="bullet"/>
+      <w:lvlText w:val=""/>
+      <w:lvlJc w:val="left"/>
+      <w:pPr>
+        <w:ind w:left="2160" w:hanging="360"/>
+      </w:pPr>
+      <w:rPr>
+        <w:rFonts w:ascii="Wingdings" w:hAnsi="Wingdings" w:hint="default"/>
+      </w:rPr>
+    </w:lvl>
+    <w:lvl w:ilvl="3" w:tplc="080A0001" w:tentative="1">
+      <w:start w:val="1"/>
+      <w:numFmt w:val="bullet"/>
+      <w:lvlText w:val=""/>
+      <w:lvlJc w:val="left"/>
+      <w:pPr>
+        <w:ind w:left="2880" w:hanging="360"/>
+      </w:pPr>
+      <w:rPr>
+        <w:rFonts w:ascii="Symbol" w:hAnsi="Symbol" w:hint="default"/>
+      </w:rPr>
+    </w:lvl>
+    <w:lvl w:ilvl="4" w:tplc="080A0003" w:tentative="1">
+      <w:start w:val="1"/>
+      <w:numFmt w:val="bullet"/>
+      <w:lvlText w:val="o"/>
+      <w:lvlJc w:val="left"/>
+      <w:pPr>
+        <w:ind w:left="3600" w:hanging="360"/>
+      </w:pPr>
+      <w:rPr>
+        <w:rFonts w:ascii="Courier New" w:hAnsi="Courier New" w:cs="Courier New" w:hint="default"/>
+      </w:rPr>
+    </w:lvl>
+    <w:lvl w:ilvl="5" w:tplc="080A0005" w:tentative="1">
+      <w:start w:val="1"/>
+      <w:numFmt w:val="bullet"/>
+      <w:lvlText w:val=""/>
+      <w:lvlJc w:val="left"/>
+      <w:pPr>
+        <w:ind w:left="4320" w:hanging="360"/>
+      </w:pPr>
+      <w:rPr>
+        <w:rFonts w:ascii="Wingdings" w:hAnsi="Wingdings" w:hint="default"/>
+      </w:rPr>
+    </w:lvl>
+    <w:lvl w:ilvl="6" w:tplc="080A0001" w:tentative="1">
+      <w:start w:val="1"/>
+      <w:numFmt w:val="bullet"/>
+      <w:lvlText w:val=""/>
+      <w:lvlJc w:val="left"/>
+      <w:pPr>
+        <w:ind w:left="5040" w:hanging="360"/>
+      </w:pPr>
+      <w:rPr>
+        <w:rFonts w:ascii="Symbol" w:hAnsi="Symbol" w:hint="default"/>
+      </w:rPr>
+    </w:lvl>
+    <w:lvl w:ilvl="7" w:tplc="080A0003" w:tentative="1">
+      <w:start w:val="1"/>
+      <w:numFmt w:val="bullet"/>
+      <w:lvlText w:val="o"/>
+      <w:lvlJc w:val="left"/>
+      <w:pPr>
+        <w:ind w:left="5760" w:hanging="360"/>
+      </w:pPr>
+      <w:rPr>
+        <w:rFonts w:ascii="Courier New" w:hAnsi="Courier New" w:cs="Courier New" w:hint="default"/>
+      </w:rPr>
+    </w:lvl>
+    <w:lvl w:ilvl="8" w:tplc="080A0005" w:tentative="1">
+      <w:start w:val="1"/>
+      <w:numFmt w:val="bullet"/>
+      <w:lvlText w:val=""/>
+      <w:lvlJc w:val="left"/>
+      <w:pPr>
+        <w:ind w:left="6480" w:hanging="360"/>
+      </w:pPr>
+      <w:rPr>
+        <w:rFonts w:ascii="Wingdings" w:hAnsi="Wingdings" w:hint="default"/>
+      </w:rPr>
+    </w:lvl>
+  </w:abstractNum>
+  <w:num w:numId="1" w16cid:durableId="2047556277">
+    <w:abstractNumId w:val="1"/>
+  </w:num>
+  <w:num w:numId="2" w16cid:durableId="2022969393">
+    <w:abstractNumId w:val="4"/>
+  </w:num>
+  <w:num w:numId="3" w16cid:durableId="755132857">
+    <w:abstractNumId w:val="0"/>
+  </w:num>
+  <w:num w:numId="4" w16cid:durableId="264115952">
+    <w:abstractNumId w:val="2"/>
+  </w:num>
+  <w:num w:numId="5" w16cid:durableId="841774913">
+    <w:abstractNumId w:val="3"/>
+  </w:num>
+</w:numbering>
 </file>
 
 <file path=word/styles.xml><?xml version="1.0" encoding="utf-8"?>
@@ -1177,6 +2223,91 @@
       <w:spacing w:after="0" w:line="240" w:lineRule="auto"/>
     </w:pPr>
   </w:style>
+  <w:style w:type="paragraph" w:styleId="TtuloTDC">
+    <w:name w:val="TOC Heading"/>
+    <w:basedOn w:val="Ttulo1"/>
+    <w:next w:val="Normal"/>
+    <w:uiPriority w:val="39"/>
+    <w:unhideWhenUsed/>
+    <w:qFormat/>
+    <w:rsid w:val="0060531D"/>
+    <w:pPr>
+      <w:spacing w:before="240" w:after="0" w:line="259" w:lineRule="auto"/>
+      <w:outlineLvl w:val="9"/>
+    </w:pPr>
+    <w:rPr>
+      <w:kern w:val="0"/>
+      <w:sz w:val="32"/>
+      <w:szCs w:val="32"/>
+      <w:lang w:eastAsia="es-MX"/>
+      <w14:ligatures w14:val="none"/>
+    </w:rPr>
+  </w:style>
+  <w:style w:type="paragraph" w:styleId="TDC1">
+    <w:name w:val="toc 1"/>
+    <w:basedOn w:val="Normal"/>
+    <w:next w:val="Normal"/>
+    <w:autoRedefine/>
+    <w:uiPriority w:val="39"/>
+    <w:unhideWhenUsed/>
+    <w:rsid w:val="0060531D"/>
+    <w:pPr>
+      <w:spacing w:after="100"/>
+    </w:pPr>
+  </w:style>
+  <w:style w:type="character" w:styleId="Hipervnculo">
+    <w:name w:val="Hyperlink"/>
+    <w:basedOn w:val="Fuentedeprrafopredeter"/>
+    <w:uiPriority w:val="99"/>
+    <w:unhideWhenUsed/>
+    <w:rsid w:val="0060531D"/>
+    <w:rPr>
+      <w:color w:val="467886" w:themeColor="hyperlink"/>
+      <w:u w:val="single"/>
+    </w:rPr>
+  </w:style>
+  <w:style w:type="paragraph" w:styleId="TDC2">
+    <w:name w:val="toc 2"/>
+    <w:basedOn w:val="Normal"/>
+    <w:next w:val="Normal"/>
+    <w:autoRedefine/>
+    <w:uiPriority w:val="39"/>
+    <w:unhideWhenUsed/>
+    <w:rsid w:val="0060531D"/>
+    <w:pPr>
+      <w:spacing w:after="100" w:line="259" w:lineRule="auto"/>
+      <w:ind w:left="220"/>
+    </w:pPr>
+    <w:rPr>
+      <w:rFonts w:eastAsiaTheme="minorEastAsia" w:cs="Times New Roman"/>
+      <w:kern w:val="0"/>
+      <w:sz w:val="22"/>
+      <w:szCs w:val="22"/>
+      <w:lang w:eastAsia="es-MX"/>
+      <w14:ligatures w14:val="none"/>
+    </w:rPr>
+  </w:style>
+  <w:style w:type="paragraph" w:styleId="TDC3">
+    <w:name w:val="toc 3"/>
+    <w:basedOn w:val="Normal"/>
+    <w:next w:val="Normal"/>
+    <w:autoRedefine/>
+    <w:uiPriority w:val="39"/>
+    <w:unhideWhenUsed/>
+    <w:rsid w:val="0060531D"/>
+    <w:pPr>
+      <w:spacing w:after="100" w:line="259" w:lineRule="auto"/>
+      <w:ind w:left="440"/>
+    </w:pPr>
+    <w:rPr>
+      <w:rFonts w:eastAsiaTheme="minorEastAsia" w:cs="Times New Roman"/>
+      <w:kern w:val="0"/>
+      <w:sz w:val="22"/>
+      <w:szCs w:val="22"/>
+      <w:lang w:eastAsia="es-MX"/>
+      <w14:ligatures w14:val="none"/>
+    </w:rPr>
+  </w:style>
 </w:styles>
 </file>
 
@@ -1493,4 +2624,16 @@
     </a:ext>
   </a:extLst>
 </a:theme>
+</file>
+
+<file path=customXml/item1.xml><?xml version="1.0" encoding="utf-8"?>
+<b:Sources xmlns:b="http://schemas.openxmlformats.org/officeDocument/2006/bibliography" xmlns="http://schemas.openxmlformats.org/officeDocument/2006/bibliography" SelectedStyle="\APASixthEditionOfficeOnline.xsl" StyleName="APA" Version="6"/>
+</file>
+
+<file path=customXml/itemProps1.xml><?xml version="1.0" encoding="utf-8"?>
+<ds:datastoreItem xmlns:ds="http://schemas.openxmlformats.org/officeDocument/2006/customXml" ds:itemID="{C2B8760D-B433-4D8E-994E-FCFA0F2AB324}">
+  <ds:schemaRefs>
+    <ds:schemaRef ds:uri="http://schemas.openxmlformats.org/officeDocument/2006/bibliography"/>
+  </ds:schemaRefs>
+</ds:datastoreItem>
 </file>
</xml_diff>

<commit_message>
adición modulo 2 en documentacion de diagramas
</commit_message>
<xml_diff>
--- a/DOCUMENTACION/documentacion_proyecto1_BD_LuisDiego.docx
+++ b/DOCUMENTACION/documentacion_proyecto1_BD_LuisDiego.docx
@@ -570,7 +570,15 @@
     </w:p>
     <w:p>
       <w:r>
-        <w:t>Esto haría que UBICACIÓN-EVENTOS tenga cardinalidad 1:N, pues una ubicación se puede relacionar con varios eventos, mientras que un evento solo se refiere a una única ubicación.</w:t>
+        <w:t xml:space="preserve">Esto haría que UBICACIÓN-EVENTOS tenga cardinalidad </w:t>
+      </w:r>
+      <w:proofErr w:type="gramStart"/>
+      <w:r>
+        <w:t>1:N</w:t>
+      </w:r>
+      <w:proofErr w:type="gramEnd"/>
+      <w:r>
+        <w:t>, pues una ubicación se puede relacionar con varios eventos, mientras que un evento solo se refiere a una única ubicación.</w:t>
       </w:r>
     </w:p>
     <w:p/>
@@ -676,9 +684,11 @@
           <w:numId w:val="4"/>
         </w:numPr>
       </w:pPr>
+      <w:proofErr w:type="spellStart"/>
       <w:r>
         <w:t>fecha_inicio</w:t>
       </w:r>
+      <w:proofErr w:type="spellEnd"/>
     </w:p>
     <w:p>
       <w:pPr>
@@ -688,9 +698,11 @@
           <w:numId w:val="4"/>
         </w:numPr>
       </w:pPr>
+      <w:proofErr w:type="spellStart"/>
       <w:r>
         <w:t>fecha_fin</w:t>
       </w:r>
+      <w:proofErr w:type="spellEnd"/>
     </w:p>
     <w:p>
       <w:pPr>
@@ -744,6 +756,97 @@
       <w:r>
         <w:t xml:space="preserve"> es NULO en caso de que se elija una clase de periodicidad distinta a ‘personalizado’, en caso contrario, se llenan ambos campos de los atributos, el primer atributo tendría un registro= ‘personalizado’ y el otro atributo tendría el intervalo en X días de repetición.</w:t>
       </w:r>
+    </w:p>
+    <w:p>
+      <w:pPr>
+        <w:pStyle w:val="Prrafodelista"/>
+      </w:pPr>
+    </w:p>
+    <w:p>
+      <w:pPr>
+        <w:pStyle w:val="Prrafodelista"/>
+      </w:pPr>
+      <w:r>
+        <w:t>Y por último tendría un atributo llamado “titulo_en_pantalla” esto es para darle algo más descriptivo a la serie del evento.</w:t>
+      </w:r>
+    </w:p>
+    <w:p>
+      <w:pPr>
+        <w:pStyle w:val="Prrafodelista"/>
+      </w:pPr>
+    </w:p>
+    <w:p>
+      <w:pPr>
+        <w:pStyle w:val="Prrafodelista"/>
+      </w:pPr>
+      <w:r>
+        <w:t xml:space="preserve">Este diagrama es más extenso, pues hay algunas entidades que deben relacionarse con otras para obtener sentido en lo que se quiere desarrollar y en los detalles brindados. Por </w:t>
+      </w:r>
+      <w:proofErr w:type="gramStart"/>
+      <w:r>
+        <w:t>ejemplo</w:t>
+      </w:r>
+      <w:proofErr w:type="gramEnd"/>
+      <w:r>
+        <w:t xml:space="preserve"> que un usuario es propietario de una serio de eventos, así también como agregar eventos y agregarle una relación junto a serie eventos, lo cual implicaría también agregar a la entidad ‘CATEGORIA’ para que eventos siga teniendo su lógica natural.</w:t>
+      </w:r>
+    </w:p>
+    <w:p>
+      <w:pPr>
+        <w:pStyle w:val="Prrafodelista"/>
+      </w:pPr>
+    </w:p>
+    <w:p>
+      <w:pPr>
+        <w:pStyle w:val="Prrafodelista"/>
+      </w:pPr>
+    </w:p>
+    <w:p>
+      <w:pPr>
+        <w:pStyle w:val="Prrafodelista"/>
+      </w:pPr>
+      <w:r>
+        <w:drawing>
+          <wp:inline distT="0" distB="0" distL="0" distR="0" wp14:anchorId="1DF73FAB" wp14:editId="59A71B1C">
+            <wp:extent cx="5612130" cy="2980690"/>
+            <wp:effectExtent l="0" t="0" r="7620" b="0"/>
+            <wp:docPr id="1045805600" name="Imagen 1"/>
+            <wp:cNvGraphicFramePr>
+              <a:graphicFrameLocks xmlns:a="http://schemas.openxmlformats.org/drawingml/2006/main" noChangeAspect="1"/>
+            </wp:cNvGraphicFramePr>
+            <a:graphic xmlns:a="http://schemas.openxmlformats.org/drawingml/2006/main">
+              <a:graphicData uri="http://schemas.openxmlformats.org/drawingml/2006/picture">
+                <pic:pic xmlns:pic="http://schemas.openxmlformats.org/drawingml/2006/picture">
+                  <pic:nvPicPr>
+                    <pic:cNvPr id="1045805600" name=""/>
+                    <pic:cNvPicPr/>
+                  </pic:nvPicPr>
+                  <pic:blipFill>
+                    <a:blip r:embed="rId8"/>
+                    <a:stretch>
+                      <a:fillRect/>
+                    </a:stretch>
+                  </pic:blipFill>
+                  <pic:spPr>
+                    <a:xfrm>
+                      <a:off x="0" y="0"/>
+                      <a:ext cx="5612130" cy="2980690"/>
+                    </a:xfrm>
+                    <a:prstGeom prst="rect">
+                      <a:avLst/>
+                    </a:prstGeom>
+                  </pic:spPr>
+                </pic:pic>
+              </a:graphicData>
+            </a:graphic>
+          </wp:inline>
+        </w:drawing>
+      </w:r>
+    </w:p>
+    <w:p>
+      <w:pPr>
+        <w:pStyle w:val="Prrafodelista"/>
+      </w:pPr>
     </w:p>
     <w:p/>
     <w:p/>

</xml_diff>

<commit_message>
DOCUMENTACION: finalización de modelo lógico
</commit_message>
<xml_diff>
--- a/DOCUMENTACION/documentacion_proyecto1_BD_LuisDiego.docx
+++ b/DOCUMENTACION/documentacion_proyecto1_BD_LuisDiego.docx
@@ -246,6 +246,15 @@
     <w:p/>
     <w:sdt>
       <w:sdtPr>
+        <w:rPr>
+          <w:rFonts w:asciiTheme="minorHAnsi" w:eastAsiaTheme="minorHAnsi" w:hAnsiTheme="minorHAnsi" w:cstheme="minorBidi"/>
+          <w:color w:val="auto"/>
+          <w:kern w:val="2"/>
+          <w:sz w:val="24"/>
+          <w:szCs w:val="24"/>
+          <w:lang w:eastAsia="en-US"/>
+          <w14:ligatures w14:val="standardContextual"/>
+        </w:rPr>
         <w:id w:val="-289667600"/>
         <w:docPartObj>
           <w:docPartGallery w:val="Table of Contents"/>
@@ -254,15 +263,8 @@
       </w:sdtPr>
       <w:sdtEndPr>
         <w:rPr>
-          <w:rFonts w:asciiTheme="minorHAnsi" w:eastAsiaTheme="minorHAnsi" w:hAnsiTheme="minorHAnsi" w:cstheme="minorBidi"/>
           <w:b/>
           <w:bCs/>
-          <w:color w:val="auto"/>
-          <w:kern w:val="2"/>
-          <w:sz w:val="24"/>
-          <w:szCs w:val="24"/>
-          <w:lang w:eastAsia="en-US"/>
-          <w14:ligatures w14:val="standardContextual"/>
         </w:rPr>
       </w:sdtEndPr>
       <w:sdtContent>
@@ -469,8 +471,13 @@
           <w:numId w:val="4"/>
         </w:numPr>
       </w:pPr>
-      <w:r>
-        <w:t>Id_ubicacion (PK)</w:t>
+      <w:proofErr w:type="spellStart"/>
+      <w:r>
+        <w:t>Id_ubicacion</w:t>
+      </w:r>
+      <w:proofErr w:type="spellEnd"/>
+      <w:r>
+        <w:t xml:space="preserve"> (PK)</w:t>
       </w:r>
     </w:p>
     <w:p>
@@ -538,7 +545,15 @@
         <w:t xml:space="preserve"> una </w:t>
       </w:r>
       <w:r>
-        <w:t>FK =id_ubicacion, que refere</w:t>
+        <w:t>FK =</w:t>
+      </w:r>
+      <w:proofErr w:type="spellStart"/>
+      <w:r>
+        <w:t>id_ubicacion</w:t>
+      </w:r>
+      <w:proofErr w:type="spellEnd"/>
+      <w:r>
+        <w:t>, que refere</w:t>
       </w:r>
       <w:r>
         <w:t>ncia justamente a la llave primaria de la entidad/</w:t>
@@ -589,6 +604,9 @@
     </w:p>
     <w:p>
       <w:r>
+        <w:rPr>
+          <w:noProof/>
+        </w:rPr>
         <w:lastRenderedPageBreak/>
         <w:drawing>
           <wp:inline distT="0" distB="0" distL="0" distR="0" wp14:anchorId="437EC6D8" wp14:editId="719F245B">
@@ -672,8 +690,13 @@
           <w:numId w:val="4"/>
         </w:numPr>
       </w:pPr>
-      <w:r>
-        <w:t>id_serie: PK</w:t>
+      <w:proofErr w:type="spellStart"/>
+      <w:r>
+        <w:t>id_serie</w:t>
+      </w:r>
+      <w:proofErr w:type="spellEnd"/>
+      <w:r>
+        <w:t>: PK</w:t>
       </w:r>
     </w:p>
     <w:p>
@@ -712,9 +735,30 @@
           <w:numId w:val="4"/>
         </w:numPr>
       </w:pPr>
+      <w:proofErr w:type="spellStart"/>
       <w:r>
         <w:lastRenderedPageBreak/>
-        <w:t>reglas_patrones_periodicidad-&gt;se divide en 3 sub-atributos. Tenemos “clase_periodicidad”, el cual nos indica si el evento se repite diaria, semanal o mensualmente</w:t>
+        <w:t>reglas_patrones_periodicidad</w:t>
+      </w:r>
+      <w:proofErr w:type="spellEnd"/>
+      <w:r>
+        <w:t xml:space="preserve">-&gt;se divide en 3 </w:t>
+      </w:r>
+      <w:proofErr w:type="spellStart"/>
+      <w:r>
+        <w:t>sub-atributos</w:t>
+      </w:r>
+      <w:proofErr w:type="spellEnd"/>
+      <w:r>
+        <w:t>. Tenemos “</w:t>
+      </w:r>
+      <w:proofErr w:type="spellStart"/>
+      <w:r>
+        <w:t>clase_periodicidad</w:t>
+      </w:r>
+      <w:proofErr w:type="spellEnd"/>
+      <w:r>
+        <w:t>”, el cual nos indica si el evento se repite diaria, semanal o mensualmente</w:t>
       </w:r>
       <w:r>
         <w:t xml:space="preserve"> o personalizado</w:t>
@@ -732,7 +776,15 @@
         <w:t xml:space="preserve"> opciones</w:t>
       </w:r>
       <w:r>
-        <w:t xml:space="preserve">). Luego contamos con “intervalo_en_dias_evento” el cual refleja cada cuanto </w:t>
+        <w:t>). Luego contamos con “</w:t>
+      </w:r>
+      <w:proofErr w:type="spellStart"/>
+      <w:r>
+        <w:t>intervalo_en_dias_evento</w:t>
+      </w:r>
+      <w:proofErr w:type="spellEnd"/>
+      <w:r>
+        <w:t xml:space="preserve">” el cual refleja cada cuanto </w:t>
       </w:r>
       <w:r>
         <w:t>se repite el evento, en caso de elegir que se repita de manera personalizada el evento.</w:t>
@@ -748,13 +800,15 @@
         <w:pStyle w:val="Prrafodelista"/>
       </w:pPr>
       <w:r>
-        <w:t xml:space="preserve"> Esto quiere decir que el atributo </w:t>
-      </w:r>
-      <w:r>
-        <w:t>“intervalo_en_dias_evento”</w:t>
-      </w:r>
-      <w:r>
-        <w:t xml:space="preserve"> es NULO en caso de que se elija una clase de periodicidad distinta a ‘personalizado’, en caso contrario, se llenan ambos campos de los atributos, el primer atributo tendría un registro= ‘personalizado’ y el otro atributo tendría el intervalo en X días de repetición.</w:t>
+        <w:t xml:space="preserve"> Esto quiere decir que el atributo “</w:t>
+      </w:r>
+      <w:proofErr w:type="spellStart"/>
+      <w:r>
+        <w:t>intervalo_en_dias_evento</w:t>
+      </w:r>
+      <w:proofErr w:type="spellEnd"/>
+      <w:r>
+        <w:t>” es NULO en caso de que se elija una clase de periodicidad distinta a ‘personalizado’, en caso contrario, se llenan ambos campos de los atributos, el primer atributo tendría un registro= ‘personalizado’ y el otro atributo tendría el intervalo en X días de repetición.</w:t>
       </w:r>
     </w:p>
     <w:p>
@@ -767,7 +821,15 @@
         <w:pStyle w:val="Prrafodelista"/>
       </w:pPr>
       <w:r>
-        <w:t>Y por último tendría un atributo llamado “titulo_en_pantalla” esto es para darle algo más descriptivo a la serie del evento.</w:t>
+        <w:t>Y por último tendría un atributo llamado “</w:t>
+      </w:r>
+      <w:proofErr w:type="spellStart"/>
+      <w:r>
+        <w:t>titulo_en_pantalla</w:t>
+      </w:r>
+      <w:proofErr w:type="spellEnd"/>
+      <w:r>
+        <w:t>” esto es para darle algo más descriptivo a la serie del evento.</w:t>
       </w:r>
     </w:p>
     <w:p>
@@ -804,6 +866,9 @@
         <w:pStyle w:val="Prrafodelista"/>
       </w:pPr>
       <w:r>
+        <w:rPr>
+          <w:noProof/>
+        </w:rPr>
         <w:drawing>
           <wp:inline distT="0" distB="0" distL="0" distR="0" wp14:anchorId="1DF73FAB" wp14:editId="59A71B1C">
             <wp:extent cx="5612130" cy="2980690"/>
@@ -857,7 +922,15 @@
     <w:p/>
     <w:p>
       <w:r>
-        <w:t>Este modulo cuenta como tal con la siguiente entidad con sus atributos:</w:t>
+        <w:t xml:space="preserve">Este </w:t>
+      </w:r>
+      <w:proofErr w:type="spellStart"/>
+      <w:r>
+        <w:t>modulo</w:t>
+      </w:r>
+      <w:proofErr w:type="spellEnd"/>
+      <w:r>
+        <w:t xml:space="preserve"> cuenta como tal con la siguiente entidad con sus atributos:</w:t>
       </w:r>
     </w:p>
     <w:p>
@@ -880,9 +953,11 @@
           <w:numId w:val="4"/>
         </w:numPr>
       </w:pPr>
+      <w:proofErr w:type="spellStart"/>
       <w:r>
         <w:t>id_tarea:PK</w:t>
       </w:r>
+      <w:proofErr w:type="spellEnd"/>
     </w:p>
     <w:p>
       <w:pPr>
@@ -952,6 +1027,9 @@
     </w:p>
     <w:p>
       <w:r>
+        <w:rPr>
+          <w:noProof/>
+        </w:rPr>
         <w:drawing>
           <wp:anchor distT="0" distB="0" distL="114300" distR="114300" simplePos="0" relativeHeight="251660288" behindDoc="0" locked="0" layoutInCell="1" allowOverlap="1" wp14:anchorId="5F534D5A" wp14:editId="24F0CF24">
             <wp:simplePos x="0" y="0"/>
@@ -1025,18 +1103,37 @@
     </w:p>
     <w:p>
       <w:r>
-        <w:t>Después de pensar de que manera se unen de manera más natural todos los elementos de los diagramas realizados + el brindado, la propuesta cumple con la lógica y también reglas de negocio.</w:t>
-      </w:r>
-    </w:p>
-    <w:p/>
-    <w:p>
-      <w:r>
+        <w:t xml:space="preserve">Después de pensar de </w:t>
+      </w:r>
+      <w:proofErr w:type="spellStart"/>
+      <w:r>
+        <w:t>que</w:t>
+      </w:r>
+      <w:proofErr w:type="spellEnd"/>
+      <w:r>
+        <w:t xml:space="preserve"> manera se unen de manera más natural todos los elementos de los diagramas realizados + el brindado, la propuesta cumple con la lógica y también reglas de negocio.</w:t>
+      </w:r>
+    </w:p>
+    <w:p/>
+    <w:p>
+      <w:r>
+        <w:rPr>
+          <w:noProof/>
+        </w:rPr>
         <w:lastRenderedPageBreak/>
         <w:drawing>
-          <wp:inline distT="0" distB="0" distL="0" distR="0" wp14:anchorId="57326062" wp14:editId="6996316F">
-            <wp:extent cx="5612130" cy="3808095"/>
-            <wp:effectExtent l="0" t="0" r="7620" b="1905"/>
-            <wp:docPr id="1536756793" name="Imagen 1"/>
+          <wp:anchor distT="0" distB="0" distL="114300" distR="114300" simplePos="0" relativeHeight="251661312" behindDoc="0" locked="0" layoutInCell="1" allowOverlap="1" wp14:anchorId="364A7D0A" wp14:editId="5F421F6B">
+            <wp:simplePos x="0" y="0"/>
+            <wp:positionH relativeFrom="column">
+              <wp:posOffset>-600075</wp:posOffset>
+            </wp:positionH>
+            <wp:positionV relativeFrom="paragraph">
+              <wp:posOffset>0</wp:posOffset>
+            </wp:positionV>
+            <wp:extent cx="6256020" cy="3374390"/>
+            <wp:effectExtent l="0" t="0" r="0" b="0"/>
+            <wp:wrapSquare wrapText="bothSides"/>
+            <wp:docPr id="791599467" name="Imagen 1"/>
             <wp:cNvGraphicFramePr>
               <a:graphicFrameLocks xmlns:a="http://schemas.openxmlformats.org/drawingml/2006/main" noChangeAspect="1"/>
             </wp:cNvGraphicFramePr>
@@ -1044,11 +1141,17 @@
               <a:graphicData uri="http://schemas.openxmlformats.org/drawingml/2006/picture">
                 <pic:pic xmlns:pic="http://schemas.openxmlformats.org/drawingml/2006/picture">
                   <pic:nvPicPr>
-                    <pic:cNvPr id="1536756793" name=""/>
+                    <pic:cNvPr id="791599467" name=""/>
                     <pic:cNvPicPr/>
                   </pic:nvPicPr>
                   <pic:blipFill>
-                    <a:blip r:embed="rId10"/>
+                    <a:blip r:embed="rId10">
+                      <a:extLst>
+                        <a:ext uri="{28A0092B-C50C-407E-A947-70E740481C1C}">
+                          <a14:useLocalDpi xmlns:a14="http://schemas.microsoft.com/office/drawing/2010/main" val="0"/>
+                        </a:ext>
+                      </a:extLst>
+                    </a:blip>
                     <a:stretch>
                       <a:fillRect/>
                     </a:stretch>
@@ -1056,7 +1159,7 @@
                   <pic:spPr>
                     <a:xfrm>
                       <a:off x="0" y="0"/>
-                      <a:ext cx="5612130" cy="3808095"/>
+                      <a:ext cx="6256020" cy="3374390"/>
                     </a:xfrm>
                     <a:prstGeom prst="rect">
                       <a:avLst/>
@@ -1065,7 +1168,7 @@
                 </pic:pic>
               </a:graphicData>
             </a:graphic>
-          </wp:inline>
+          </wp:anchor>
         </w:drawing>
       </w:r>
       <w:r>
@@ -1086,8 +1189,404 @@
     <w:p/>
     <w:p/>
     <w:p>
+      <w:pPr>
+        <w:pStyle w:val="Subttulo"/>
+      </w:pPr>
       <w:r>
         <w:t>MODELO LÓGICO</w:t>
+      </w:r>
+    </w:p>
+    <w:p>
+      <w:r>
+        <w:t xml:space="preserve">Una </w:t>
+      </w:r>
+      <w:proofErr w:type="spellStart"/>
+      <w:r>
+        <w:t>ves</w:t>
+      </w:r>
+      <w:proofErr w:type="spellEnd"/>
+      <w:r>
+        <w:t xml:space="preserve"> completado toda la parte conceptual y visual para comprender de una manera más simplificada los problemas presentados, pues podemos convertir las nuevas entidades con sus atributos y relaciones en Tablas y presentar las tablas de las entidades </w:t>
+      </w:r>
+      <w:r>
+        <w:t>modificadas,</w:t>
+      </w:r>
+      <w:r>
+        <w:t xml:space="preserve"> en base al modelo lógico visto en el curso</w:t>
+      </w:r>
+      <w:r>
+        <w:t xml:space="preserve">, el </w:t>
+      </w:r>
+      <w:proofErr w:type="spellStart"/>
+      <w:r>
+        <w:t>cuál</w:t>
+      </w:r>
+      <w:proofErr w:type="spellEnd"/>
+      <w:r>
+        <w:t xml:space="preserve"> se presenta de la siguiente manera:</w:t>
+      </w:r>
+    </w:p>
+    <w:p/>
+    <w:p>
+      <w:pPr>
+        <w:pStyle w:val="Prrafodelista"/>
+        <w:numPr>
+          <w:ilvl w:val="0"/>
+          <w:numId w:val="2"/>
+        </w:numPr>
+      </w:pPr>
+      <w:r>
+        <w:t>UBICACIONES</w:t>
+      </w:r>
+      <w:r>
+        <w:t xml:space="preserve"> (</w:t>
+      </w:r>
+      <w:proofErr w:type="spellStart"/>
+      <w:r>
+        <w:rPr>
+          <w:u w:val="single"/>
+        </w:rPr>
+        <w:t>id_</w:t>
+      </w:r>
+      <w:r>
+        <w:rPr>
+          <w:u w:val="single"/>
+        </w:rPr>
+        <w:t>ubicacion</w:t>
+      </w:r>
+      <w:proofErr w:type="spellEnd"/>
+      <w:r>
+        <w:t xml:space="preserve"> [</w:t>
+      </w:r>
+      <w:r>
+        <w:t xml:space="preserve">PK], nombre, ciudad, </w:t>
+      </w:r>
+      <w:proofErr w:type="spellStart"/>
+      <w:r>
+        <w:t>direccion</w:t>
+      </w:r>
+      <w:proofErr w:type="spellEnd"/>
+      <w:r>
+        <w:t>, capacidad)</w:t>
+      </w:r>
+    </w:p>
+    <w:p>
+      <w:pPr>
+        <w:pStyle w:val="Prrafodelista"/>
+        <w:numPr>
+          <w:ilvl w:val="0"/>
+          <w:numId w:val="2"/>
+        </w:numPr>
+      </w:pPr>
+      <w:r>
+        <w:t>SERIES_EVENTOS (</w:t>
+      </w:r>
+      <w:proofErr w:type="spellStart"/>
+      <w:r>
+        <w:rPr>
+          <w:u w:val="single"/>
+        </w:rPr>
+        <w:t>id_</w:t>
+      </w:r>
+      <w:r>
+        <w:rPr>
+          <w:u w:val="single"/>
+        </w:rPr>
+        <w:t>serie</w:t>
+      </w:r>
+      <w:proofErr w:type="spellEnd"/>
+      <w:r>
+        <w:t xml:space="preserve"> [</w:t>
+      </w:r>
+      <w:r>
+        <w:t xml:space="preserve">PK], </w:t>
+      </w:r>
+      <w:proofErr w:type="spellStart"/>
+      <w:r>
+        <w:t>id_usuario_</w:t>
+      </w:r>
+      <w:r>
+        <w:t>propietario</w:t>
+      </w:r>
+      <w:proofErr w:type="spellEnd"/>
+      <w:r>
+        <w:t xml:space="preserve"> [</w:t>
+      </w:r>
+      <w:r>
+        <w:t xml:space="preserve">FK], </w:t>
+      </w:r>
+      <w:proofErr w:type="spellStart"/>
+      <w:r>
+        <w:t>titulo_serie</w:t>
+      </w:r>
+      <w:proofErr w:type="spellEnd"/>
+      <w:r>
+        <w:t xml:space="preserve">, </w:t>
+      </w:r>
+      <w:proofErr w:type="spellStart"/>
+      <w:r>
+        <w:t>fecha_inicio</w:t>
+      </w:r>
+      <w:proofErr w:type="spellEnd"/>
+      <w:r>
+        <w:t xml:space="preserve">, </w:t>
+      </w:r>
+      <w:proofErr w:type="spellStart"/>
+      <w:r>
+        <w:t>fecha_fin</w:t>
+      </w:r>
+      <w:proofErr w:type="spellEnd"/>
+      <w:r>
+        <w:t xml:space="preserve">, </w:t>
+      </w:r>
+      <w:proofErr w:type="spellStart"/>
+      <w:r>
+        <w:t>clase_periodicidad</w:t>
+      </w:r>
+      <w:proofErr w:type="spellEnd"/>
+      <w:r>
+        <w:t xml:space="preserve">, </w:t>
+      </w:r>
+      <w:proofErr w:type="spellStart"/>
+      <w:r>
+        <w:t>intervalo_en_dias_evento</w:t>
+      </w:r>
+      <w:proofErr w:type="spellEnd"/>
+      <w:r>
+        <w:t xml:space="preserve">, </w:t>
+      </w:r>
+      <w:proofErr w:type="spellStart"/>
+      <w:r>
+        <w:t>reserva_dias_especifios_eventos</w:t>
+      </w:r>
+      <w:proofErr w:type="spellEnd"/>
+      <w:r>
+        <w:t>)</w:t>
+      </w:r>
+    </w:p>
+    <w:p>
+      <w:pPr>
+        <w:pStyle w:val="Prrafodelista"/>
+      </w:pPr>
+    </w:p>
+    <w:p>
+      <w:pPr>
+        <w:pStyle w:val="Prrafodelista"/>
+        <w:numPr>
+          <w:ilvl w:val="0"/>
+          <w:numId w:val="4"/>
+        </w:numPr>
+        <w:rPr>
+          <w:highlight w:val="cyan"/>
+        </w:rPr>
+      </w:pPr>
+      <w:r>
+        <w:rPr>
+          <w:highlight w:val="cyan"/>
+        </w:rPr>
+        <w:lastRenderedPageBreak/>
+        <w:t>NOTA 1: Esta tabla tendremos una restricción CHECK para los últimos 2 atributos, esto para confirmar que las entradas en los datos estén alineadas con las posibles opciones (diario, semanal, mensual, personalizado) y que existe consistencia entre el diseño + almacenamiento junto con las reglas de negocio.</w:t>
+      </w:r>
+    </w:p>
+    <w:p>
+      <w:pPr>
+        <w:pStyle w:val="Prrafodelista"/>
+        <w:rPr>
+          <w:highlight w:val="cyan"/>
+        </w:rPr>
+      </w:pPr>
+    </w:p>
+    <w:p>
+      <w:pPr>
+        <w:pStyle w:val="Prrafodelista"/>
+        <w:numPr>
+          <w:ilvl w:val="0"/>
+          <w:numId w:val="4"/>
+        </w:numPr>
+        <w:rPr>
+          <w:highlight w:val="cyan"/>
+        </w:rPr>
+      </w:pPr>
+      <w:r>
+        <w:rPr>
+          <w:highlight w:val="cyan"/>
+        </w:rPr>
+        <w:t>NOTA 2: En esta tabla se pueden dar ciertos casos como los siguientes: ‘</w:t>
+      </w:r>
+      <w:proofErr w:type="spellStart"/>
+      <w:r>
+        <w:rPr>
+          <w:highlight w:val="cyan"/>
+        </w:rPr>
+        <w:t>reserva_dias_especificos</w:t>
+      </w:r>
+      <w:proofErr w:type="spellEnd"/>
+      <w:r>
+        <w:rPr>
+          <w:highlight w:val="cyan"/>
+        </w:rPr>
+        <w:t>’ será nulo, solo en caso de que ‘clase periodicidad’ se agregue como ‘personalizado’</w:t>
+      </w:r>
+      <w:r>
+        <w:rPr>
+          <w:highlight w:val="cyan"/>
+        </w:rPr>
+        <w:t>. El otro caso es en el que ´</w:t>
+      </w:r>
+      <w:proofErr w:type="spellStart"/>
+      <w:r>
+        <w:rPr>
+          <w:highlight w:val="cyan"/>
+        </w:rPr>
+        <w:t>reserva_dias_especificos</w:t>
+      </w:r>
+      <w:proofErr w:type="spellEnd"/>
+      <w:r>
+        <w:rPr>
+          <w:highlight w:val="cyan"/>
+        </w:rPr>
+        <w:t>’ puede ser Nulo debido a que ‘</w:t>
+      </w:r>
+      <w:proofErr w:type="spellStart"/>
+      <w:r>
+        <w:rPr>
+          <w:highlight w:val="cyan"/>
+        </w:rPr>
+        <w:t>clase_periodicidad</w:t>
+      </w:r>
+      <w:proofErr w:type="spellEnd"/>
+      <w:r>
+        <w:rPr>
+          <w:highlight w:val="cyan"/>
+        </w:rPr>
+        <w:t>’ es semanal</w:t>
+      </w:r>
+      <w:r>
+        <w:rPr>
+          <w:highlight w:val="cyan"/>
+        </w:rPr>
+        <w:t xml:space="preserve">, pero si las ocurrencias son semanales, pero por ejemplo con 2 </w:t>
+      </w:r>
+      <w:proofErr w:type="spellStart"/>
+      <w:r>
+        <w:rPr>
+          <w:highlight w:val="cyan"/>
+        </w:rPr>
+        <w:t>dias</w:t>
+      </w:r>
+      <w:proofErr w:type="spellEnd"/>
+      <w:r>
+        <w:rPr>
+          <w:highlight w:val="cyan"/>
+        </w:rPr>
+        <w:t xml:space="preserve"> a la semana, ahí si se deben agregar.</w:t>
+      </w:r>
+    </w:p>
+    <w:p>
+      <w:pPr>
+        <w:pStyle w:val="Prrafodelista"/>
+        <w:rPr>
+          <w:highlight w:val="cyan"/>
+        </w:rPr>
+      </w:pPr>
+    </w:p>
+    <w:p>
+      <w:pPr>
+        <w:pStyle w:val="Prrafodelista"/>
+        <w:numPr>
+          <w:ilvl w:val="0"/>
+          <w:numId w:val="2"/>
+        </w:numPr>
+      </w:pPr>
+      <w:r>
+        <w:t>TAREAS (id_</w:t>
+      </w:r>
+      <w:proofErr w:type="gramStart"/>
+      <w:r>
+        <w:t>tarea[</w:t>
+      </w:r>
+      <w:proofErr w:type="gramEnd"/>
+      <w:r>
+        <w:t>PK], id_usuario_a_</w:t>
+      </w:r>
+      <w:proofErr w:type="gramStart"/>
+      <w:r>
+        <w:t>cargo[</w:t>
+      </w:r>
+      <w:proofErr w:type="gramEnd"/>
+      <w:r>
+        <w:t xml:space="preserve">FK], </w:t>
+      </w:r>
+      <w:r>
+        <w:t>id_</w:t>
+      </w:r>
+      <w:proofErr w:type="gramStart"/>
+      <w:r>
+        <w:t>evento[</w:t>
+      </w:r>
+      <w:proofErr w:type="gramEnd"/>
+      <w:r>
+        <w:t>FK],</w:t>
+      </w:r>
+      <w:r>
+        <w:t xml:space="preserve"> titulo, descripción, prioridad, fecha_limite, estado)</w:t>
+      </w:r>
+    </w:p>
+    <w:p>
+      <w:r>
+        <w:t xml:space="preserve">Y por ultimo la tabla modificada </w:t>
+      </w:r>
+    </w:p>
+    <w:p>
+      <w:r>
+        <w:t>EVENTOS (</w:t>
+      </w:r>
+      <w:proofErr w:type="spellStart"/>
+      <w:r>
+        <w:t>id_</w:t>
+      </w:r>
+      <w:proofErr w:type="gramStart"/>
+      <w:r>
+        <w:t>ubicacion</w:t>
+      </w:r>
+      <w:proofErr w:type="spellEnd"/>
+      <w:r>
+        <w:t>[</w:t>
+      </w:r>
+      <w:proofErr w:type="gramEnd"/>
+      <w:r>
+        <w:t xml:space="preserve">FK], </w:t>
+      </w:r>
+      <w:proofErr w:type="spellStart"/>
+      <w:r>
+        <w:t>id_</w:t>
+      </w:r>
+      <w:proofErr w:type="gramStart"/>
+      <w:r>
+        <w:t>serie</w:t>
+      </w:r>
+      <w:proofErr w:type="spellEnd"/>
+      <w:r>
+        <w:t>[</w:t>
+      </w:r>
+      <w:proofErr w:type="gramEnd"/>
+      <w:r>
+        <w:t>FK</w:t>
+      </w:r>
+      <w:r>
+        <w:t>]) estos</w:t>
+      </w:r>
+      <w:r>
+        <w:t xml:space="preserve"> valores pueden ser nulos.</w:t>
+      </w:r>
+    </w:p>
+    <w:p/>
+    <w:p>
+      <w:pPr>
+        <w:pStyle w:val="Subttulo"/>
+      </w:pPr>
+      <w:r>
+        <w:t>MODELO FÍSICO</w:t>
       </w:r>
     </w:p>
     <w:p/>
@@ -1288,6 +1787,95 @@
     </w:lvl>
   </w:abstractNum>
   <w:abstractNum w:abstractNumId="2" w15:restartNumberingAfterBreak="0">
+    <w:nsid w:val="3A115016"/>
+    <w:multiLevelType w:val="hybridMultilevel"/>
+    <w:tmpl w:val="8C88B3EE"/>
+    <w:lvl w:ilvl="0" w:tplc="080A0011">
+      <w:start w:val="1"/>
+      <w:numFmt w:val="decimal"/>
+      <w:lvlText w:val="%1)"/>
+      <w:lvlJc w:val="left"/>
+      <w:pPr>
+        <w:ind w:left="720" w:hanging="360"/>
+      </w:pPr>
+      <w:rPr>
+        <w:rFonts w:hint="default"/>
+      </w:rPr>
+    </w:lvl>
+    <w:lvl w:ilvl="1" w:tplc="080A0019" w:tentative="1">
+      <w:start w:val="1"/>
+      <w:numFmt w:val="lowerLetter"/>
+      <w:lvlText w:val="%2."/>
+      <w:lvlJc w:val="left"/>
+      <w:pPr>
+        <w:ind w:left="1440" w:hanging="360"/>
+      </w:pPr>
+    </w:lvl>
+    <w:lvl w:ilvl="2" w:tplc="080A001B" w:tentative="1">
+      <w:start w:val="1"/>
+      <w:numFmt w:val="lowerRoman"/>
+      <w:lvlText w:val="%3."/>
+      <w:lvlJc w:val="right"/>
+      <w:pPr>
+        <w:ind w:left="2160" w:hanging="180"/>
+      </w:pPr>
+    </w:lvl>
+    <w:lvl w:ilvl="3" w:tplc="080A000F" w:tentative="1">
+      <w:start w:val="1"/>
+      <w:numFmt w:val="decimal"/>
+      <w:lvlText w:val="%4."/>
+      <w:lvlJc w:val="left"/>
+      <w:pPr>
+        <w:ind w:left="2880" w:hanging="360"/>
+      </w:pPr>
+    </w:lvl>
+    <w:lvl w:ilvl="4" w:tplc="080A0019" w:tentative="1">
+      <w:start w:val="1"/>
+      <w:numFmt w:val="lowerLetter"/>
+      <w:lvlText w:val="%5."/>
+      <w:lvlJc w:val="left"/>
+      <w:pPr>
+        <w:ind w:left="3600" w:hanging="360"/>
+      </w:pPr>
+    </w:lvl>
+    <w:lvl w:ilvl="5" w:tplc="080A001B" w:tentative="1">
+      <w:start w:val="1"/>
+      <w:numFmt w:val="lowerRoman"/>
+      <w:lvlText w:val="%6."/>
+      <w:lvlJc w:val="right"/>
+      <w:pPr>
+        <w:ind w:left="4320" w:hanging="180"/>
+      </w:pPr>
+    </w:lvl>
+    <w:lvl w:ilvl="6" w:tplc="080A000F" w:tentative="1">
+      <w:start w:val="1"/>
+      <w:numFmt w:val="decimal"/>
+      <w:lvlText w:val="%7."/>
+      <w:lvlJc w:val="left"/>
+      <w:pPr>
+        <w:ind w:left="5040" w:hanging="360"/>
+      </w:pPr>
+    </w:lvl>
+    <w:lvl w:ilvl="7" w:tplc="080A0019" w:tentative="1">
+      <w:start w:val="1"/>
+      <w:numFmt w:val="lowerLetter"/>
+      <w:lvlText w:val="%8."/>
+      <w:lvlJc w:val="left"/>
+      <w:pPr>
+        <w:ind w:left="5760" w:hanging="360"/>
+      </w:pPr>
+    </w:lvl>
+    <w:lvl w:ilvl="8" w:tplc="080A001B" w:tentative="1">
+      <w:start w:val="1"/>
+      <w:numFmt w:val="lowerRoman"/>
+      <w:lvlText w:val="%9."/>
+      <w:lvlJc w:val="right"/>
+      <w:pPr>
+        <w:ind w:left="6480" w:hanging="180"/>
+      </w:pPr>
+    </w:lvl>
+  </w:abstractNum>
+  <w:abstractNum w:abstractNumId="3" w15:restartNumberingAfterBreak="0">
     <w:nsid w:val="49493616"/>
     <w:multiLevelType w:val="hybridMultilevel"/>
     <w:tmpl w:val="748A5512"/>
@@ -1399,7 +1987,7 @@
       </w:rPr>
     </w:lvl>
   </w:abstractNum>
-  <w:abstractNum w:abstractNumId="3" w15:restartNumberingAfterBreak="0">
+  <w:abstractNum w:abstractNumId="4" w15:restartNumberingAfterBreak="0">
     <w:nsid w:val="4DCC4FE9"/>
     <w:multiLevelType w:val="hybridMultilevel"/>
     <w:tmpl w:val="48FC83DA"/>
@@ -1512,7 +2100,7 @@
       </w:rPr>
     </w:lvl>
   </w:abstractNum>
-  <w:abstractNum w:abstractNumId="4" w15:restartNumberingAfterBreak="0">
+  <w:abstractNum w:abstractNumId="5" w15:restartNumberingAfterBreak="0">
     <w:nsid w:val="56E00D8E"/>
     <w:multiLevelType w:val="hybridMultilevel"/>
     <w:tmpl w:val="B39626FE"/>
@@ -1601,7 +2189,7 @@
       </w:pPr>
     </w:lvl>
   </w:abstractNum>
-  <w:abstractNum w:abstractNumId="5" w15:restartNumberingAfterBreak="0">
+  <w:abstractNum w:abstractNumId="6" w15:restartNumberingAfterBreak="0">
     <w:nsid w:val="70676394"/>
     <w:multiLevelType w:val="hybridMultilevel"/>
     <w:tmpl w:val="2062C996"/>
@@ -1714,22 +2302,25 @@
     </w:lvl>
   </w:abstractNum>
   <w:num w:numId="1" w16cid:durableId="2047556277">
-    <w:abstractNumId w:val="2"/>
+    <w:abstractNumId w:val="3"/>
   </w:num>
   <w:num w:numId="2" w16cid:durableId="2022969393">
-    <w:abstractNumId w:val="5"/>
+    <w:abstractNumId w:val="6"/>
   </w:num>
   <w:num w:numId="3" w16cid:durableId="755132857">
     <w:abstractNumId w:val="0"/>
   </w:num>
   <w:num w:numId="4" w16cid:durableId="264115952">
-    <w:abstractNumId w:val="3"/>
+    <w:abstractNumId w:val="4"/>
   </w:num>
   <w:num w:numId="5" w16cid:durableId="841774913">
-    <w:abstractNumId w:val="4"/>
+    <w:abstractNumId w:val="5"/>
   </w:num>
   <w:num w:numId="6" w16cid:durableId="504635039">
     <w:abstractNumId w:val="1"/>
+  </w:num>
+  <w:num w:numId="7" w16cid:durableId="2129354706">
+    <w:abstractNumId w:val="2"/>
   </w:num>
 </w:numbering>
 </file>

</xml_diff>

<commit_message>
documentacion: poner atributos en modelo fisico y su tipo de dato
</commit_message>
<xml_diff>
--- a/DOCUMENTACION/documentacion_proyecto1_BD_LuisDiego.docx
+++ b/DOCUMENTACION/documentacion_proyecto1_BD_LuisDiego.docx
@@ -618,15 +618,7 @@
     </w:p>
     <w:p>
       <w:r>
-        <w:t xml:space="preserve">Esto haría que UBICACIÓN-EVENTOS tenga cardinalidad </w:t>
-      </w:r>
-      <w:proofErr w:type="gramStart"/>
-      <w:r>
-        <w:t>1:N</w:t>
-      </w:r>
-      <w:proofErr w:type="gramEnd"/>
-      <w:r>
-        <w:t>, pues una ubicación se puede relacionar con varios eventos, mientras que un evento solo se refiere a una única ubicación.</w:t>
+        <w:t>Esto haría que UBICACIÓN-EVENTOS tenga cardinalidad 1:N, pues una ubicación se puede relacionar con varios eventos, mientras que un evento solo se refiere a una única ubicación.</w:t>
       </w:r>
     </w:p>
     <w:p/>
@@ -1542,34 +1534,10 @@
         </w:numPr>
       </w:pPr>
       <w:r>
-        <w:t>TAREAS (id_</w:t>
-      </w:r>
-      <w:proofErr w:type="gramStart"/>
-      <w:r>
-        <w:t>tarea[</w:t>
-      </w:r>
-      <w:proofErr w:type="gramEnd"/>
-      <w:r>
-        <w:t>PK], id_usuario_a_</w:t>
-      </w:r>
-      <w:proofErr w:type="gramStart"/>
-      <w:r>
-        <w:t>cargo[</w:t>
-      </w:r>
-      <w:proofErr w:type="gramEnd"/>
-      <w:r>
-        <w:t xml:space="preserve">FK], </w:t>
-      </w:r>
-      <w:r>
-        <w:t>id_</w:t>
-      </w:r>
-      <w:proofErr w:type="gramStart"/>
-      <w:r>
-        <w:t>evento[</w:t>
-      </w:r>
-      <w:proofErr w:type="gramEnd"/>
-      <w:r>
-        <w:t>FK],</w:t>
+        <w:t xml:space="preserve">TAREAS (id_tarea[PK], id_usuario_a_cargo[FK], </w:t>
+      </w:r>
+      <w:r>
+        <w:t>id_evento[FK],</w:t>
       </w:r>
       <w:r>
         <w:t xml:space="preserve"> titulo, descripción, prioridad, fecha_limite, estado)</w:t>
@@ -1587,35 +1555,19 @@
       </w:r>
       <w:proofErr w:type="spellStart"/>
       <w:r>
-        <w:t>id_</w:t>
-      </w:r>
-      <w:proofErr w:type="gramStart"/>
-      <w:r>
-        <w:t>ubicacion</w:t>
-      </w:r>
-      <w:proofErr w:type="spellEnd"/>
-      <w:r>
-        <w:t>[</w:t>
-      </w:r>
-      <w:proofErr w:type="gramEnd"/>
-      <w:r>
-        <w:t xml:space="preserve">FK], </w:t>
-      </w:r>
-      <w:proofErr w:type="spellStart"/>
-      <w:r>
-        <w:t>id_</w:t>
-      </w:r>
-      <w:proofErr w:type="gramStart"/>
-      <w:r>
-        <w:t>serie</w:t>
-      </w:r>
-      <w:proofErr w:type="spellEnd"/>
-      <w:r>
-        <w:t>[</w:t>
-      </w:r>
-      <w:proofErr w:type="gramEnd"/>
-      <w:r>
-        <w:t>FK</w:t>
+        <w:t>id_ubicacion</w:t>
+      </w:r>
+      <w:proofErr w:type="spellEnd"/>
+      <w:r>
+        <w:t xml:space="preserve">[FK], </w:t>
+      </w:r>
+      <w:proofErr w:type="spellStart"/>
+      <w:r>
+        <w:t>id_serie</w:t>
+      </w:r>
+      <w:proofErr w:type="spellEnd"/>
+      <w:r>
+        <w:t>[FK</w:t>
       </w:r>
       <w:r>
         <w:t>]) estos</w:t>
@@ -2036,7 +1988,6 @@
         <w:t xml:space="preserve">ciudad </w:t>
       </w:r>
       <w:proofErr w:type="spellStart"/>
-      <w:proofErr w:type="gramStart"/>
       <w:r>
         <w:rPr>
           <w:b/>
@@ -2046,11 +1997,7 @@
       </w:r>
       <w:proofErr w:type="spellEnd"/>
       <w:r>
-        <w:t>(</w:t>
-      </w:r>
-      <w:proofErr w:type="gramEnd"/>
-      <w:r>
-        <w:t xml:space="preserve">60) </w:t>
+        <w:t xml:space="preserve">(60) </w:t>
       </w:r>
       <w:proofErr w:type="spellStart"/>
       <w:r>
@@ -2104,7 +2051,6 @@
         <w:t xml:space="preserve"> </w:t>
       </w:r>
       <w:proofErr w:type="spellStart"/>
-      <w:proofErr w:type="gramStart"/>
       <w:r>
         <w:rPr>
           <w:b/>
@@ -2114,11 +2060,7 @@
       </w:r>
       <w:proofErr w:type="spellEnd"/>
       <w:r>
-        <w:t>(</w:t>
-      </w:r>
-      <w:proofErr w:type="gramEnd"/>
-      <w:r>
-        <w:t xml:space="preserve">120) </w:t>
+        <w:t xml:space="preserve">(120) </w:t>
       </w:r>
       <w:proofErr w:type="spellStart"/>
       <w:r>
@@ -2255,7 +2197,13 @@
           <w:tcPr>
             <w:tcW w:w="4414" w:type="dxa"/>
           </w:tcPr>
-          <w:p/>
+          <w:p>
+            <w:proofErr w:type="spellStart"/>
+            <w:r>
+              <w:t>id_serie</w:t>
+            </w:r>
+            <w:proofErr w:type="spellEnd"/>
+          </w:p>
         </w:tc>
         <w:tc>
           <w:tcPr>
@@ -2269,7 +2217,13 @@
           <w:tcPr>
             <w:tcW w:w="4414" w:type="dxa"/>
           </w:tcPr>
-          <w:p/>
+          <w:p>
+            <w:proofErr w:type="spellStart"/>
+            <w:r>
+              <w:t>Id_usuario_dueño</w:t>
+            </w:r>
+            <w:proofErr w:type="spellEnd"/>
+          </w:p>
         </w:tc>
         <w:tc>
           <w:tcPr>
@@ -2283,7 +2237,13 @@
           <w:tcPr>
             <w:tcW w:w="4414" w:type="dxa"/>
           </w:tcPr>
-          <w:p/>
+          <w:p>
+            <w:proofErr w:type="spellStart"/>
+            <w:r>
+              <w:t>titulo_serie</w:t>
+            </w:r>
+            <w:proofErr w:type="spellEnd"/>
+          </w:p>
         </w:tc>
         <w:tc>
           <w:tcPr>
@@ -2297,7 +2257,13 @@
           <w:tcPr>
             <w:tcW w:w="4414" w:type="dxa"/>
           </w:tcPr>
-          <w:p/>
+          <w:p>
+            <w:proofErr w:type="spellStart"/>
+            <w:r>
+              <w:t>fecha_inicio</w:t>
+            </w:r>
+            <w:proofErr w:type="spellEnd"/>
+          </w:p>
         </w:tc>
         <w:tc>
           <w:tcPr>
@@ -2311,7 +2277,13 @@
           <w:tcPr>
             <w:tcW w:w="4414" w:type="dxa"/>
           </w:tcPr>
-          <w:p/>
+          <w:p>
+            <w:proofErr w:type="spellStart"/>
+            <w:r>
+              <w:t>fecha_fin</w:t>
+            </w:r>
+            <w:proofErr w:type="spellEnd"/>
+          </w:p>
         </w:tc>
         <w:tc>
           <w:tcPr>
@@ -3656,6 +3628,7 @@
   <w:style w:type="character" w:default="1" w:styleId="Fuentedeprrafopredeter">
     <w:name w:val="Default Paragraph Font"/>
     <w:uiPriority w:val="1"/>
+    <w:semiHidden/>
     <w:unhideWhenUsed/>
   </w:style>
   <w:style w:type="table" w:default="1" w:styleId="Tablanormal">

</xml_diff>

<commit_message>
tabla 2 tipos de dato
</commit_message>
<xml_diff>
--- a/DOCUMENTACION/documentacion_proyecto1_BD_LuisDiego.docx
+++ b/DOCUMENTACION/documentacion_proyecto1_BD_LuisDiego.docx
@@ -297,7 +297,7 @@
           <w:r>
             <w:fldChar w:fldCharType="separate"/>
           </w:r>
-          <w:hyperlink w:anchor="_Toc239684316" w:history="1">
+          <w:hyperlink w:anchor="_Toc240060216" w:history="1">
             <w:r>
               <w:rPr>
                 <w:rStyle w:val="Hipervnculo"/>
@@ -324,7 +324,7 @@
                 <w:noProof/>
                 <w:webHidden/>
               </w:rPr>
-              <w:instrText xml:space="preserve"> PAGEREF _Toc239684316 \h </w:instrText>
+              <w:instrText xml:space="preserve"> PAGEREF _Toc240060216 \h </w:instrText>
             </w:r>
             <w:r>
               <w:rPr>
@@ -344,7 +344,80 @@
                 <w:noProof/>
                 <w:webHidden/>
               </w:rPr>
-              <w:t>3</w:t>
+              <w:t>4</w:t>
+            </w:r>
+            <w:r>
+              <w:rPr>
+                <w:noProof/>
+                <w:webHidden/>
+              </w:rPr>
+              <w:fldChar w:fldCharType="end"/>
+            </w:r>
+          </w:hyperlink>
+        </w:p>
+        <w:p>
+          <w:pPr>
+            <w:pStyle w:val="TDC2"/>
+            <w:tabs>
+              <w:tab w:val="right" w:leader="dot" w:pos="8828"/>
+            </w:tabs>
+            <w:rPr>
+              <w:rFonts w:cstheme="minorBidi"/>
+              <w:noProof/>
+              <w:kern w:val="2"/>
+              <w:sz w:val="24"/>
+              <w:szCs w:val="24"/>
+              <w14:ligatures w14:val="standardContextual"/>
+            </w:rPr>
+          </w:pPr>
+          <w:hyperlink w:anchor="_Toc240060217" w:history="1">
+            <w:r>
+              <w:rPr>
+                <w:rStyle w:val="Hipervnculo"/>
+                <w:noProof/>
+              </w:rPr>
+              <w:t>MODELO FÍSICO</w:t>
+            </w:r>
+            <w:r>
+              <w:rPr>
+                <w:noProof/>
+                <w:webHidden/>
+              </w:rPr>
+              <w:tab/>
+            </w:r>
+            <w:r>
+              <w:rPr>
+                <w:noProof/>
+                <w:webHidden/>
+              </w:rPr>
+              <w:fldChar w:fldCharType="begin"/>
+            </w:r>
+            <w:r>
+              <w:rPr>
+                <w:noProof/>
+                <w:webHidden/>
+              </w:rPr>
+              <w:instrText xml:space="preserve"> PAGEREF _Toc240060217 \h </w:instrText>
+            </w:r>
+            <w:r>
+              <w:rPr>
+                <w:noProof/>
+                <w:webHidden/>
+              </w:rPr>
+            </w:r>
+            <w:r>
+              <w:rPr>
+                <w:noProof/>
+                <w:webHidden/>
+              </w:rPr>
+              <w:fldChar w:fldCharType="separate"/>
+            </w:r>
+            <w:r>
+              <w:rPr>
+                <w:noProof/>
+                <w:webHidden/>
+              </w:rPr>
+              <w:t>10</w:t>
             </w:r>
             <w:r>
               <w:rPr>
@@ -391,7 +464,6 @@
       <w:pPr>
         <w:pStyle w:val="Ttulo1"/>
       </w:pPr>
-      <w:bookmarkStart w:id="0" w:name="_Toc239684316"/>
     </w:p>
     <w:p/>
     <w:p/>
@@ -430,6 +502,7 @@
       <w:pPr>
         <w:pStyle w:val="Ttulo1"/>
       </w:pPr>
+      <w:bookmarkStart w:id="0" w:name="_Toc240060216"/>
       <w:r>
         <w:t>MODELOS CONCEPTUALES</w:t>
       </w:r>
@@ -504,13 +577,8 @@
           <w:numId w:val="4"/>
         </w:numPr>
       </w:pPr>
-      <w:proofErr w:type="spellStart"/>
-      <w:r>
-        <w:t>Id_ubicacion</w:t>
-      </w:r>
-      <w:proofErr w:type="spellEnd"/>
-      <w:r>
-        <w:t xml:space="preserve"> (PK)</w:t>
+      <w:r>
+        <w:t>Id_ubicacion (PK)</w:t>
       </w:r>
     </w:p>
     <w:p>
@@ -578,15 +646,7 @@
         <w:t xml:space="preserve"> una </w:t>
       </w:r>
       <w:r>
-        <w:t>FK =</w:t>
-      </w:r>
-      <w:proofErr w:type="spellStart"/>
-      <w:r>
-        <w:t>id_ubicacion</w:t>
-      </w:r>
-      <w:proofErr w:type="spellEnd"/>
-      <w:r>
-        <w:t>, que refere</w:t>
+        <w:t>FK =id_ubicacion, que refere</w:t>
       </w:r>
       <w:r>
         <w:t>ncia justamente a la llave primaria de la entidad/</w:t>
@@ -618,6 +678,7 @@
     </w:p>
     <w:p>
       <w:r>
+        <w:lastRenderedPageBreak/>
         <w:t>Esto haría que UBICACIÓN-EVENTOS tenga cardinalidad 1:N, pues una ubicación se puede relacionar con varios eventos, mientras que un evento solo se refiere a una única ubicación.</w:t>
       </w:r>
     </w:p>
@@ -691,6 +752,7 @@
     <w:p/>
     <w:p>
       <w:r>
+        <w:lastRenderedPageBreak/>
         <w:t>Las entidades identificadas con sus atributos son:</w:t>
       </w:r>
     </w:p>
@@ -714,13 +776,8 @@
           <w:numId w:val="4"/>
         </w:numPr>
       </w:pPr>
-      <w:proofErr w:type="spellStart"/>
-      <w:r>
-        <w:t>id_serie</w:t>
-      </w:r>
-      <w:proofErr w:type="spellEnd"/>
-      <w:r>
-        <w:t>: PK</w:t>
+      <w:r>
+        <w:t>id_serie: PK</w:t>
       </w:r>
     </w:p>
     <w:p>
@@ -731,12 +788,9 @@
           <w:numId w:val="4"/>
         </w:numPr>
       </w:pPr>
-      <w:proofErr w:type="spellStart"/>
-      <w:r>
-        <w:lastRenderedPageBreak/>
+      <w:r>
         <w:t>fecha_inicio</w:t>
       </w:r>
-      <w:proofErr w:type="spellEnd"/>
     </w:p>
     <w:p>
       <w:pPr>
@@ -746,11 +800,9 @@
           <w:numId w:val="4"/>
         </w:numPr>
       </w:pPr>
-      <w:proofErr w:type="spellStart"/>
       <w:r>
         <w:t>fecha_fin</w:t>
       </w:r>
-      <w:proofErr w:type="spellEnd"/>
     </w:p>
     <w:p>
       <w:pPr>
@@ -760,29 +812,8 @@
           <w:numId w:val="4"/>
         </w:numPr>
       </w:pPr>
-      <w:proofErr w:type="spellStart"/>
-      <w:r>
-        <w:t>reglas_patrones_periodicidad</w:t>
-      </w:r>
-      <w:proofErr w:type="spellEnd"/>
-      <w:r>
-        <w:t xml:space="preserve">-&gt;se divide en 3 </w:t>
-      </w:r>
-      <w:proofErr w:type="spellStart"/>
-      <w:r>
-        <w:t>sub-atributos</w:t>
-      </w:r>
-      <w:proofErr w:type="spellEnd"/>
-      <w:r>
-        <w:t>. Tenemos “</w:t>
-      </w:r>
-      <w:proofErr w:type="spellStart"/>
-      <w:r>
-        <w:t>clase_periodicidad</w:t>
-      </w:r>
-      <w:proofErr w:type="spellEnd"/>
-      <w:r>
-        <w:t>”, el cual nos indica si el evento se repite diaria, semanal o mensualmente</w:t>
+      <w:r>
+        <w:t>reglas_patrones_periodicidad-&gt;se divide en 3 sub-atributos. Tenemos “clase_periodicidad”, el cual nos indica si el evento se repite diaria, semanal o mensualmente</w:t>
       </w:r>
       <w:r>
         <w:t xml:space="preserve"> o personalizado</w:t>
@@ -800,15 +831,7 @@
         <w:t xml:space="preserve"> opciones</w:t>
       </w:r>
       <w:r>
-        <w:t>). Luego contamos con “</w:t>
-      </w:r>
-      <w:proofErr w:type="spellStart"/>
-      <w:r>
-        <w:t>intervalo_en_dias_evento</w:t>
-      </w:r>
-      <w:proofErr w:type="spellEnd"/>
-      <w:r>
-        <w:t xml:space="preserve">” el cual refleja cada cuanto </w:t>
+        <w:t xml:space="preserve">). Luego contamos con “intervalo_en_dias_evento” el cual refleja cada cuanto </w:t>
       </w:r>
       <w:r>
         <w:t>se repite el evento, en caso de elegir que se repita de manera personalizada el evento.</w:t>
@@ -824,15 +847,7 @@
         <w:pStyle w:val="Prrafodelista"/>
       </w:pPr>
       <w:r>
-        <w:t xml:space="preserve"> Esto quiere decir que el atributo “</w:t>
-      </w:r>
-      <w:proofErr w:type="spellStart"/>
-      <w:r>
-        <w:t>intervalo_en_dias_evento</w:t>
-      </w:r>
-      <w:proofErr w:type="spellEnd"/>
-      <w:r>
-        <w:t>” es NULO en caso de que se elija una clase de periodicidad distinta a ‘personalizado’, en caso contrario, se llenan ambos campos de los atributos, el primer atributo tendría un registro= ‘personalizado’ y el otro atributo tendría el intervalo en X días de repetición.</w:t>
+        <w:t xml:space="preserve"> Esto quiere decir que el atributo “intervalo_en_dias_evento” es NULO en caso de que se elija una clase de periodicidad distinta a ‘personalizado’, en caso contrario, se llenan ambos campos de los atributos, el primer atributo tendría un registro= ‘personalizado’ y el otro atributo tendría el intervalo en X días de repetición.</w:t>
       </w:r>
     </w:p>
     <w:p>
@@ -845,15 +860,7 @@
         <w:pStyle w:val="Prrafodelista"/>
       </w:pPr>
       <w:r>
-        <w:t>Y por último tendría un atributo llamado “</w:t>
-      </w:r>
-      <w:proofErr w:type="spellStart"/>
-      <w:r>
-        <w:t>titulo_en_pantalla</w:t>
-      </w:r>
-      <w:proofErr w:type="spellEnd"/>
-      <w:r>
-        <w:t>” esto es para darle algo más descriptivo a la serie del evento.</w:t>
+        <w:t>Y por último tendría un atributo llamado “titulo_en_pantalla” esto es para darle algo más descriptivo a la serie del evento.</w:t>
       </w:r>
     </w:p>
     <w:p>
@@ -956,15 +963,7 @@
     <w:p/>
     <w:p>
       <w:r>
-        <w:t xml:space="preserve">Este </w:t>
-      </w:r>
-      <w:proofErr w:type="spellStart"/>
-      <w:r>
-        <w:t>modulo</w:t>
-      </w:r>
-      <w:proofErr w:type="spellEnd"/>
-      <w:r>
-        <w:t xml:space="preserve"> cuenta como tal con la siguiente entidad con sus atributos:</w:t>
+        <w:t>Este modulo cuenta como tal con la siguiente entidad con sus atributos:</w:t>
       </w:r>
     </w:p>
     <w:p>
@@ -987,11 +986,9 @@
           <w:numId w:val="4"/>
         </w:numPr>
       </w:pPr>
-      <w:proofErr w:type="spellStart"/>
       <w:r>
         <w:t>id_tarea:PK</w:t>
       </w:r>
-      <w:proofErr w:type="spellEnd"/>
     </w:p>
     <w:p>
       <w:pPr>
@@ -1138,15 +1135,7 @@
     </w:p>
     <w:p>
       <w:r>
-        <w:t xml:space="preserve">Después de pensar de </w:t>
-      </w:r>
-      <w:proofErr w:type="spellStart"/>
-      <w:r>
-        <w:t>que</w:t>
-      </w:r>
-      <w:proofErr w:type="spellEnd"/>
-      <w:r>
-        <w:t xml:space="preserve"> manera se unen de manera más natural todos los elementos de los diagramas realizados + el brindado, la propuesta cumple con la lógica y también reglas de negocio.</w:t>
+        <w:t>Después de pensar de que manera se unen de manera más natural todos los elementos de los diagramas realizados + el brindado, la propuesta cumple con la lógica y también reglas de negocio.</w:t>
       </w:r>
     </w:p>
     <w:p/>
@@ -1234,15 +1223,7 @@
     </w:p>
     <w:p>
       <w:r>
-        <w:t xml:space="preserve">Una </w:t>
-      </w:r>
-      <w:proofErr w:type="spellStart"/>
-      <w:r>
-        <w:t>ves</w:t>
-      </w:r>
-      <w:proofErr w:type="spellEnd"/>
-      <w:r>
-        <w:t xml:space="preserve"> completado toda la parte conceptual y visual para comprender de una manera más simplificada los problemas presentados, pues podemos convertir las nuevas entidades con sus atributos y relaciones en Tablas y presentar las tablas de las entidades </w:t>
+        <w:t xml:space="preserve">Una ves completado toda la parte conceptual y visual para comprender de una manera más simplificada los problemas presentados, pues podemos convertir las nuevas entidades con sus atributos y relaciones en Tablas y presentar las tablas de las entidades </w:t>
       </w:r>
       <w:r>
         <w:t>modificadas,</w:t>
@@ -1251,15 +1232,7 @@
         <w:t xml:space="preserve"> en base al modelo lógico visto en el curso</w:t>
       </w:r>
       <w:r>
-        <w:t xml:space="preserve">, el </w:t>
-      </w:r>
-      <w:proofErr w:type="spellStart"/>
-      <w:r>
-        <w:t>cuál</w:t>
-      </w:r>
-      <w:proofErr w:type="spellEnd"/>
-      <w:r>
-        <w:t xml:space="preserve"> se presenta de la siguiente manera:</w:t>
+        <w:t>, el cuál se presenta de la siguiente manera:</w:t>
       </w:r>
     </w:p>
     <w:p/>
@@ -1277,7 +1250,6 @@
       <w:r>
         <w:t xml:space="preserve"> (</w:t>
       </w:r>
-      <w:proofErr w:type="spellStart"/>
       <w:r>
         <w:rPr>
           <w:u w:val="single"/>
@@ -1290,20 +1262,11 @@
         </w:rPr>
         <w:t>ubicacion</w:t>
       </w:r>
-      <w:proofErr w:type="spellEnd"/>
       <w:r>
         <w:t xml:space="preserve"> [</w:t>
       </w:r>
       <w:r>
-        <w:t xml:space="preserve">PK], nombre, ciudad, </w:t>
-      </w:r>
-      <w:proofErr w:type="spellStart"/>
-      <w:r>
-        <w:t>direccion</w:t>
-      </w:r>
-      <w:proofErr w:type="spellEnd"/>
-      <w:r>
-        <w:t>, capacidad)</w:t>
+        <w:t>PK], nombre, ciudad, direccion, capacidad)</w:t>
       </w:r>
     </w:p>
     <w:p>
@@ -1317,7 +1280,6 @@
       <w:r>
         <w:t>SERIES_EVENTOS (</w:t>
       </w:r>
-      <w:proofErr w:type="spellStart"/>
       <w:r>
         <w:rPr>
           <w:u w:val="single"/>
@@ -1330,74 +1292,17 @@
         </w:rPr>
         <w:t>serie</w:t>
       </w:r>
-      <w:proofErr w:type="spellEnd"/>
       <w:r>
         <w:t xml:space="preserve"> [</w:t>
       </w:r>
       <w:r>
-        <w:t xml:space="preserve">PK], </w:t>
-      </w:r>
-      <w:proofErr w:type="spellStart"/>
-      <w:r>
-        <w:t>id_usuario_</w:t>
-      </w:r>
-      <w:r>
-        <w:t>propietario</w:t>
-      </w:r>
-      <w:proofErr w:type="spellEnd"/>
-      <w:r>
-        <w:t xml:space="preserve"> [</w:t>
-      </w:r>
-      <w:r>
-        <w:t xml:space="preserve">FK], </w:t>
-      </w:r>
-      <w:proofErr w:type="spellStart"/>
-      <w:r>
-        <w:t>titulo_serie</w:t>
-      </w:r>
-      <w:proofErr w:type="spellEnd"/>
-      <w:r>
-        <w:t xml:space="preserve">, </w:t>
-      </w:r>
-      <w:proofErr w:type="spellStart"/>
-      <w:r>
-        <w:t>fecha_inicio</w:t>
-      </w:r>
-      <w:proofErr w:type="spellEnd"/>
-      <w:r>
-        <w:t xml:space="preserve">, </w:t>
-      </w:r>
-      <w:proofErr w:type="spellStart"/>
-      <w:r>
-        <w:t>fecha_fin</w:t>
-      </w:r>
-      <w:proofErr w:type="spellEnd"/>
-      <w:r>
-        <w:t xml:space="preserve">, </w:t>
-      </w:r>
-      <w:proofErr w:type="spellStart"/>
-      <w:r>
-        <w:t>clase_periodicidad</w:t>
-      </w:r>
-      <w:proofErr w:type="spellEnd"/>
-      <w:r>
-        <w:t xml:space="preserve">, </w:t>
-      </w:r>
-      <w:proofErr w:type="spellStart"/>
-      <w:r>
-        <w:t>intervalo_en_dias_evento</w:t>
-      </w:r>
-      <w:proofErr w:type="spellEnd"/>
-      <w:r>
-        <w:t xml:space="preserve">, </w:t>
-      </w:r>
-      <w:proofErr w:type="spellStart"/>
-      <w:r>
-        <w:t>reserva_dias_especifios_eventos</w:t>
-      </w:r>
-      <w:proofErr w:type="spellEnd"/>
-      <w:r>
-        <w:t>)</w:t>
+        <w:t>PK], id_usuario_</w:t>
+      </w:r>
+      <w:r>
+        <w:t>propietario [</w:t>
+      </w:r>
+      <w:r>
+        <w:t>FK], titulo_serie, fecha_inicio, fecha_fin, clase_periodicidad, intervalo_en_dias_evento, reserva_dias_especifios_eventos)</w:t>
       </w:r>
     </w:p>
     <w:p>
@@ -1446,75 +1351,19 @@
         <w:rPr>
           <w:highlight w:val="cyan"/>
         </w:rPr>
-        <w:t>NOTA 2: En esta tabla se pueden dar ciertos casos como los siguientes: ‘</w:t>
-      </w:r>
-      <w:proofErr w:type="spellStart"/>
+        <w:t>NOTA 2: En esta tabla se pueden dar ciertos casos como los siguientes: ‘reserva_dias_especificos’ será nulo, solo en caso de que ‘clase periodicidad’ se agregue como ‘personalizado’</w:t>
+      </w:r>
       <w:r>
         <w:rPr>
           <w:highlight w:val="cyan"/>
         </w:rPr>
-        <w:t>reserva_dias_especificos</w:t>
-      </w:r>
-      <w:proofErr w:type="spellEnd"/>
+        <w:t>. El otro caso es en el que ´reserva_dias_especificos’ puede ser Nulo debido a que ‘clase_periodicidad’ es semanal</w:t>
+      </w:r>
       <w:r>
         <w:rPr>
           <w:highlight w:val="cyan"/>
         </w:rPr>
-        <w:t>’ será nulo, solo en caso de que ‘clase periodicidad’ se agregue como ‘personalizado’</w:t>
-      </w:r>
-      <w:r>
-        <w:rPr>
-          <w:highlight w:val="cyan"/>
-        </w:rPr>
-        <w:t>. El otro caso es en el que ´</w:t>
-      </w:r>
-      <w:proofErr w:type="spellStart"/>
-      <w:r>
-        <w:rPr>
-          <w:highlight w:val="cyan"/>
-        </w:rPr>
-        <w:t>reserva_dias_especificos</w:t>
-      </w:r>
-      <w:proofErr w:type="spellEnd"/>
-      <w:r>
-        <w:rPr>
-          <w:highlight w:val="cyan"/>
-        </w:rPr>
-        <w:t>’ puede ser Nulo debido a que ‘</w:t>
-      </w:r>
-      <w:proofErr w:type="spellStart"/>
-      <w:r>
-        <w:rPr>
-          <w:highlight w:val="cyan"/>
-        </w:rPr>
-        <w:t>clase_periodicidad</w:t>
-      </w:r>
-      <w:proofErr w:type="spellEnd"/>
-      <w:r>
-        <w:rPr>
-          <w:highlight w:val="cyan"/>
-        </w:rPr>
-        <w:t>’ es semanal</w:t>
-      </w:r>
-      <w:r>
-        <w:rPr>
-          <w:highlight w:val="cyan"/>
-        </w:rPr>
-        <w:t xml:space="preserve">, pero si las ocurrencias son semanales, pero por ejemplo con 2 </w:t>
-      </w:r>
-      <w:proofErr w:type="spellStart"/>
-      <w:r>
-        <w:rPr>
-          <w:highlight w:val="cyan"/>
-        </w:rPr>
-        <w:t>dias</w:t>
-      </w:r>
-      <w:proofErr w:type="spellEnd"/>
-      <w:r>
-        <w:rPr>
-          <w:highlight w:val="cyan"/>
-        </w:rPr>
-        <w:t xml:space="preserve"> a la semana, ahí si se deben agregar.</w:t>
+        <w:t>, pero si las ocurrencias son semanales, pero por ejemplo con 2 dias a la semana, ahí si se deben agregar.</w:t>
       </w:r>
     </w:p>
     <w:p>
@@ -1551,23 +1400,7 @@
     <w:p>
       <w:r>
         <w:lastRenderedPageBreak/>
-        <w:t>EVENTOS (</w:t>
-      </w:r>
-      <w:proofErr w:type="spellStart"/>
-      <w:r>
-        <w:t>id_ubicacion</w:t>
-      </w:r>
-      <w:proofErr w:type="spellEnd"/>
-      <w:r>
-        <w:t xml:space="preserve">[FK], </w:t>
-      </w:r>
-      <w:proofErr w:type="spellStart"/>
-      <w:r>
-        <w:t>id_serie</w:t>
-      </w:r>
-      <w:proofErr w:type="spellEnd"/>
-      <w:r>
-        <w:t>[FK</w:t>
+        <w:t>EVENTOS (id_ubicacion[FK], id_serie[FK</w:t>
       </w:r>
       <w:r>
         <w:t>]) estos</w:t>
@@ -1628,11 +1461,13 @@
     <w:p/>
     <w:p>
       <w:pPr>
-        <w:pStyle w:val="Subttulo"/>
-      </w:pPr>
+        <w:pStyle w:val="Ttulo2"/>
+      </w:pPr>
+      <w:bookmarkStart w:id="1" w:name="_Toc240060217"/>
       <w:r>
         <w:t>MODELO FÍSICO</w:t>
       </w:r>
+      <w:bookmarkEnd w:id="1"/>
     </w:p>
     <w:p/>
     <w:p>
@@ -1690,11 +1525,9 @@
             <w:tcW w:w="4414" w:type="dxa"/>
           </w:tcPr>
           <w:p>
-            <w:proofErr w:type="spellStart"/>
             <w:r>
               <w:t>id_ubicacion</w:t>
             </w:r>
-            <w:proofErr w:type="spellEnd"/>
           </w:p>
         </w:tc>
         <w:tc>
@@ -1779,11 +1612,9 @@
             <w:tcW w:w="4414" w:type="dxa"/>
           </w:tcPr>
           <w:p>
-            <w:proofErr w:type="spellStart"/>
             <w:r>
               <w:t>direccion</w:t>
             </w:r>
-            <w:proofErr w:type="spellEnd"/>
           </w:p>
         </w:tc>
         <w:tc>
@@ -1844,7 +1675,6 @@
       </w:r>
     </w:p>
     <w:p>
-      <w:proofErr w:type="spellStart"/>
       <w:r>
         <w:rPr>
           <w:b/>
@@ -1853,7 +1683,6 @@
         <w:lastRenderedPageBreak/>
         <w:t>create</w:t>
       </w:r>
-      <w:proofErr w:type="spellEnd"/>
       <w:r>
         <w:t xml:space="preserve"> </w:t>
       </w:r>
@@ -1871,16 +1700,8 @@
     <w:p>
       <w:r>
         <w:tab/>
-      </w:r>
-      <w:proofErr w:type="spellStart"/>
-      <w:r>
-        <w:t>id_ubicacion</w:t>
-      </w:r>
-      <w:proofErr w:type="spellEnd"/>
-      <w:r>
-        <w:t xml:space="preserve"> SERIAL </w:t>
-      </w:r>
-      <w:proofErr w:type="spellStart"/>
+        <w:t xml:space="preserve">id_ubicacion SERIAL </w:t>
+      </w:r>
       <w:r>
         <w:rPr>
           <w:b/>
@@ -1888,11 +1709,9 @@
         </w:rPr>
         <w:t>primary</w:t>
       </w:r>
-      <w:proofErr w:type="spellEnd"/>
       <w:r>
         <w:t xml:space="preserve"> </w:t>
       </w:r>
-      <w:proofErr w:type="spellStart"/>
       <w:r>
         <w:rPr>
           <w:b/>
@@ -1900,7 +1719,6 @@
         </w:rPr>
         <w:t>key</w:t>
       </w:r>
-      <w:proofErr w:type="spellEnd"/>
       <w:r>
         <w:t>,</w:t>
       </w:r>
@@ -1987,7 +1805,6 @@
       <w:r>
         <w:t xml:space="preserve">ciudad </w:t>
       </w:r>
-      <w:proofErr w:type="spellStart"/>
       <w:r>
         <w:rPr>
           <w:b/>
@@ -1995,11 +1812,9 @@
         </w:rPr>
         <w:t>varchar</w:t>
       </w:r>
-      <w:proofErr w:type="spellEnd"/>
       <w:r>
         <w:t xml:space="preserve">(60) </w:t>
       </w:r>
-      <w:proofErr w:type="spellStart"/>
       <w:r>
         <w:rPr>
           <w:b/>
@@ -2007,11 +1822,9 @@
         </w:rPr>
         <w:t>not</w:t>
       </w:r>
-      <w:proofErr w:type="spellEnd"/>
       <w:r>
         <w:t xml:space="preserve"> </w:t>
       </w:r>
-      <w:proofErr w:type="spellStart"/>
       <w:r>
         <w:rPr>
           <w:b/>
@@ -2019,7 +1832,6 @@
         </w:rPr>
         <w:t>null</w:t>
       </w:r>
-      <w:proofErr w:type="spellEnd"/>
       <w:r>
         <w:t>,</w:t>
       </w:r>
@@ -2027,30 +1839,14 @@
     <w:p>
       <w:r>
         <w:tab/>
-        <w:t xml:space="preserve">--este atributo no es </w:t>
-      </w:r>
-      <w:proofErr w:type="spellStart"/>
-      <w:r>
-        <w:t>unico</w:t>
-      </w:r>
-      <w:proofErr w:type="spellEnd"/>
-      <w:r>
-        <w:t>, pues sino no se cumple lo de gestionar varias salas que pueden estar en la misma ciudad</w:t>
+        <w:t>--este atributo no es unico, pues sino no se cumple lo de gestionar varias salas que pueden estar en la misma ciudad</w:t>
       </w:r>
     </w:p>
     <w:p>
       <w:r>
         <w:tab/>
-      </w:r>
-      <w:proofErr w:type="spellStart"/>
-      <w:r>
-        <w:t>direccion</w:t>
-      </w:r>
-      <w:proofErr w:type="spellEnd"/>
-      <w:r>
-        <w:t xml:space="preserve"> </w:t>
-      </w:r>
-      <w:proofErr w:type="spellStart"/>
+        <w:t xml:space="preserve">direccion </w:t>
+      </w:r>
       <w:r>
         <w:rPr>
           <w:b/>
@@ -2058,11 +1854,9 @@
         </w:rPr>
         <w:t>varchar</w:t>
       </w:r>
-      <w:proofErr w:type="spellEnd"/>
       <w:r>
         <w:t xml:space="preserve">(120) </w:t>
       </w:r>
-      <w:proofErr w:type="spellStart"/>
       <w:r>
         <w:rPr>
           <w:b/>
@@ -2070,11 +1864,9 @@
         </w:rPr>
         <w:t>not</w:t>
       </w:r>
-      <w:proofErr w:type="spellEnd"/>
       <w:r>
         <w:t xml:space="preserve"> </w:t>
       </w:r>
-      <w:proofErr w:type="spellStart"/>
       <w:r>
         <w:rPr>
           <w:b/>
@@ -2082,7 +1874,6 @@
         </w:rPr>
         <w:t>null</w:t>
       </w:r>
-      <w:proofErr w:type="spellEnd"/>
       <w:r>
         <w:t>,</w:t>
       </w:r>
@@ -2092,7 +1883,6 @@
         <w:tab/>
         <w:t xml:space="preserve">capacidad </w:t>
       </w:r>
-      <w:proofErr w:type="spellStart"/>
       <w:r>
         <w:rPr>
           <w:b/>
@@ -2100,11 +1890,9 @@
         </w:rPr>
         <w:t>int</w:t>
       </w:r>
-      <w:proofErr w:type="spellEnd"/>
       <w:r>
         <w:t xml:space="preserve"> </w:t>
       </w:r>
-      <w:proofErr w:type="spellStart"/>
       <w:r>
         <w:rPr>
           <w:b/>
@@ -2112,11 +1900,9 @@
         </w:rPr>
         <w:t>not</w:t>
       </w:r>
-      <w:proofErr w:type="spellEnd"/>
       <w:r>
         <w:t xml:space="preserve"> </w:t>
       </w:r>
-      <w:proofErr w:type="spellStart"/>
       <w:r>
         <w:rPr>
           <w:b/>
@@ -2124,28 +1910,11 @@
         </w:rPr>
         <w:t>null</w:t>
       </w:r>
-      <w:proofErr w:type="spellEnd"/>
     </w:p>
     <w:p>
       <w:r>
         <w:tab/>
-        <w:t xml:space="preserve">--poner capacidad </w:t>
-      </w:r>
-      <w:proofErr w:type="spellStart"/>
-      <w:r>
-        <w:t>not</w:t>
-      </w:r>
-      <w:proofErr w:type="spellEnd"/>
-      <w:r>
-        <w:t xml:space="preserve"> </w:t>
-      </w:r>
-      <w:proofErr w:type="spellStart"/>
-      <w:r>
-        <w:t>null</w:t>
-      </w:r>
-      <w:proofErr w:type="spellEnd"/>
-      <w:r>
-        <w:t xml:space="preserve"> responde al requerimiento funcional #10 acerca de los reportes</w:t>
+        <w:t>--poner capacidad not null responde al requerimiento funcional #10 acerca de los reportes</w:t>
       </w:r>
     </w:p>
     <w:p>
@@ -2198,18 +1967,20 @@
             <w:tcW w:w="4414" w:type="dxa"/>
           </w:tcPr>
           <w:p>
-            <w:proofErr w:type="spellStart"/>
             <w:r>
               <w:t>id_serie</w:t>
             </w:r>
-            <w:proofErr w:type="spellEnd"/>
           </w:p>
         </w:tc>
         <w:tc>
           <w:tcPr>
             <w:tcW w:w="4414" w:type="dxa"/>
           </w:tcPr>
-          <w:p/>
+          <w:p>
+            <w:r>
+              <w:t>SERIAL, PRIMARY KEY</w:t>
+            </w:r>
+          </w:p>
         </w:tc>
       </w:tr>
       <w:tr>
@@ -2218,18 +1989,20 @@
             <w:tcW w:w="4414" w:type="dxa"/>
           </w:tcPr>
           <w:p>
-            <w:proofErr w:type="spellStart"/>
             <w:r>
               <w:t>Id_usuario_dueño</w:t>
             </w:r>
-            <w:proofErr w:type="spellEnd"/>
           </w:p>
         </w:tc>
         <w:tc>
           <w:tcPr>
             <w:tcW w:w="4414" w:type="dxa"/>
           </w:tcPr>
-          <w:p/>
+          <w:p>
+            <w:r>
+              <w:t>INT REFERENCES USUARIOS(id_usuario)</w:t>
+            </w:r>
+          </w:p>
         </w:tc>
       </w:tr>
       <w:tr>
@@ -2238,18 +2011,20 @@
             <w:tcW w:w="4414" w:type="dxa"/>
           </w:tcPr>
           <w:p>
-            <w:proofErr w:type="spellStart"/>
             <w:r>
               <w:t>titulo_serie</w:t>
             </w:r>
-            <w:proofErr w:type="spellEnd"/>
           </w:p>
         </w:tc>
         <w:tc>
           <w:tcPr>
             <w:tcW w:w="4414" w:type="dxa"/>
           </w:tcPr>
-          <w:p/>
+          <w:p>
+            <w:r>
+              <w:t>VARCHAR(100)</w:t>
+            </w:r>
+          </w:p>
         </w:tc>
       </w:tr>
       <w:tr>
@@ -2258,18 +2033,20 @@
             <w:tcW w:w="4414" w:type="dxa"/>
           </w:tcPr>
           <w:p>
-            <w:proofErr w:type="spellStart"/>
             <w:r>
               <w:t>fecha_inicio</w:t>
             </w:r>
-            <w:proofErr w:type="spellEnd"/>
           </w:p>
         </w:tc>
         <w:tc>
           <w:tcPr>
             <w:tcW w:w="4414" w:type="dxa"/>
           </w:tcPr>
-          <w:p/>
+          <w:p>
+            <w:r>
+              <w:t>DATE</w:t>
+            </w:r>
+          </w:p>
         </w:tc>
       </w:tr>
       <w:tr>
@@ -2278,23 +2055,112 @@
             <w:tcW w:w="4414" w:type="dxa"/>
           </w:tcPr>
           <w:p>
-            <w:proofErr w:type="spellStart"/>
             <w:r>
               <w:t>fecha_fin</w:t>
             </w:r>
-            <w:proofErr w:type="spellEnd"/>
           </w:p>
         </w:tc>
         <w:tc>
           <w:tcPr>
             <w:tcW w:w="4414" w:type="dxa"/>
           </w:tcPr>
-          <w:p/>
+          <w:p>
+            <w:r>
+              <w:t>DATE</w:t>
+            </w:r>
+          </w:p>
+        </w:tc>
+      </w:tr>
+      <w:tr>
+        <w:tc>
+          <w:tcPr>
+            <w:tcW w:w="4414" w:type="dxa"/>
+          </w:tcPr>
+          <w:p>
+            <w:r>
+              <w:t>c</w:t>
+            </w:r>
+            <w:r>
+              <w:t>lase periodicidad</w:t>
+            </w:r>
+          </w:p>
+        </w:tc>
+        <w:tc>
+          <w:tcPr>
+            <w:tcW w:w="4414" w:type="dxa"/>
+          </w:tcPr>
+          <w:p>
+            <w:r>
+              <w:t>VARCHAR(15</w:t>
+            </w:r>
+            <w:r>
+              <w:t>)</w:t>
+            </w:r>
+            <w:r>
+              <w:t>. Debe ser: diaria,semanal, mensual o personalizado la cadena de caracteres</w:t>
+            </w:r>
+          </w:p>
+        </w:tc>
+      </w:tr>
+      <w:tr>
+        <w:tc>
+          <w:tcPr>
+            <w:tcW w:w="4414" w:type="dxa"/>
+          </w:tcPr>
+          <w:p>
+            <w:r>
+              <w:t>i</w:t>
+            </w:r>
+            <w:r>
+              <w:t>ntervalo_en_dias_eventos</w:t>
+            </w:r>
+          </w:p>
+        </w:tc>
+        <w:tc>
+          <w:tcPr>
+            <w:tcW w:w="4414" w:type="dxa"/>
+          </w:tcPr>
+          <w:p>
+            <w:r>
+              <w:t xml:space="preserve">INT </w:t>
+            </w:r>
+          </w:p>
+        </w:tc>
+      </w:tr>
+      <w:tr>
+        <w:tc>
+          <w:tcPr>
+            <w:tcW w:w="4414" w:type="dxa"/>
+          </w:tcPr>
+          <w:p>
+            <w:r>
+              <w:t>reserva_dias_especificos</w:t>
+            </w:r>
+          </w:p>
+        </w:tc>
+        <w:tc>
+          <w:tcPr>
+            <w:tcW w:w="4414" w:type="dxa"/>
+          </w:tcPr>
+          <w:p>
+            <w:r>
+              <w:t>VARCHAR(50)</w:t>
+            </w:r>
+          </w:p>
         </w:tc>
       </w:tr>
     </w:tbl>
     <w:p/>
-    <w:p/>
+    <w:p>
+      <w:r>
+        <w:t xml:space="preserve">RECORDAR: </w:t>
+      </w:r>
+    </w:p>
+    <w:p>
+      <w:r>
+        <w:t>intervalo_en_dias_eventos va a ser nulo, a menos que la clase_periodicidad= ‘periodicidad’</w:t>
+      </w:r>
+    </w:p>
     <w:sectPr>
       <w:pgSz w:w="12240" w:h="15840"/>
       <w:pgMar w:top="1417" w:right="1701" w:bottom="1417" w:left="1701" w:header="708" w:footer="708" w:gutter="0"/>
@@ -3453,7 +3319,6 @@
     <w:next w:val="Normal"/>
     <w:link w:val="Ttulo2Car"/>
     <w:uiPriority w:val="9"/>
-    <w:semiHidden/>
     <w:unhideWhenUsed/>
     <w:qFormat/>
     <w:rsid w:val="00A84435"/>
@@ -3670,7 +3535,6 @@
     <w:basedOn w:val="Fuentedeprrafopredeter"/>
     <w:link w:val="Ttulo2"/>
     <w:uiPriority w:val="9"/>
-    <w:semiHidden/>
     <w:rsid w:val="00A84435"/>
     <w:rPr>
       <w:rFonts w:asciiTheme="majorHAnsi" w:eastAsiaTheme="majorEastAsia" w:hAnsiTheme="majorHAnsi" w:cstheme="majorBidi"/>

</xml_diff>